<commit_message>
Remove obsolete deliverables and tidy public documentation
</commit_message>
<xml_diff>
--- a/reports/Пограничные_примеры.docx
+++ b/reports/Пограничные_примеры.docx
@@ -4,17 +4,23 @@
   <w:body>
     <w:p>
       <w:pPr>
-        <w:pStyle w:val="Heading1"/>
+        <w:pStyle w:val="Title"/>
+        <w:spacing w:after="100" w:line="259" w:lineRule="auto"/>
       </w:pPr>
       <w:r>
         <w:rPr>
           <w:b w:val="0"/>
           <w:i w:val="0"/>
+          <w:color w:val="000000"/>
+          <w:sz w:val="40"/>
         </w:rPr>
         <w:t>Пограничные примеры из тестовой выборки</w:t>
       </w:r>
     </w:p>
     <w:p>
+      <w:pPr>
+        <w:spacing w:after="100" w:line="259" w:lineRule="auto"/>
+      </w:pPr>
       <w:r>
         <w:rPr>
           <w:b w:val="0"/>
@@ -24,6 +30,9 @@
       </w:r>
     </w:p>
     <w:p>
+      <w:pPr>
+        <w:spacing w:after="100" w:line="259" w:lineRule="auto"/>
+      </w:pPr>
       <w:r>
         <w:rPr>
           <w:b w:val="0"/>
@@ -47,6 +56,9 @@
       </w:r>
     </w:p>
     <w:p>
+      <w:pPr>
+        <w:spacing w:after="100" w:line="259" w:lineRule="auto"/>
+      </w:pPr>
       <w:r>
         <w:rPr>
           <w:b/>
@@ -63,6 +75,9 @@
       </w:r>
     </w:p>
     <w:p>
+      <w:pPr>
+        <w:spacing w:after="100" w:line="259" w:lineRule="auto"/>
+      </w:pPr>
       <w:r>
         <w:rPr>
           <w:b w:val="0"/>
@@ -86,6 +101,9 @@
       </w:r>
     </w:p>
     <w:p>
+      <w:pPr>
+        <w:spacing w:after="100" w:line="259" w:lineRule="auto"/>
+      </w:pPr>
       <w:r>
         <w:rPr>
           <w:b w:val="0"/>
@@ -97,6 +115,7 @@
     <w:p>
       <w:pPr>
         <w:pStyle w:val="Heading2"/>
+        <w:spacing w:after="100" w:line="259" w:lineRule="auto"/>
       </w:pPr>
       <w:r>
         <w:rPr>
@@ -107,6 +126,9 @@
       </w:r>
     </w:p>
     <w:p>
+      <w:pPr>
+        <w:spacing w:after="100" w:line="259" w:lineRule="auto"/>
+      </w:pPr>
       <w:r>
         <w:rPr>
           <w:b w:val="0"/>
@@ -140,10 +162,12 @@
           <w:b w:val="0"/>
           <w:i w:val="0"/>
         </w:rPr>
-        <w:t>*</w:t>
       </w:r>
     </w:p>
     <w:p>
+      <w:pPr>
+        <w:spacing w:after="100" w:line="259" w:lineRule="auto"/>
+      </w:pPr>
       <w:r>
         <w:rPr>
           <w:b w:val="0"/>
@@ -153,15 +177,21 @@
       </w:r>
     </w:p>
     <w:p>
+      <w:pPr>
+        <w:spacing w:after="100" w:line="259" w:lineRule="auto"/>
+      </w:pPr>
       <w:r>
         <w:rPr>
           <w:b w:val="0"/>
           <w:i w:val="0"/>
         </w:rPr>
-        <w:t>* «Полоса неопределённости» — вероятность от 0.46 до 0.86:</w:t>
+        <w:t xml:space="preserve"> «Полоса неопределённости» — вероятность от 0.46 до 0.86:</w:t>
       </w:r>
     </w:p>
     <w:p>
+      <w:pPr>
+        <w:spacing w:after="100" w:line="259" w:lineRule="auto"/>
+      </w:pPr>
       <w:r>
         <w:rPr>
           <w:b/>
@@ -178,6 +208,9 @@
       </w:r>
     </w:p>
     <w:p>
+      <w:pPr>
+        <w:spacing w:after="100" w:line="259" w:lineRule="auto"/>
+      </w:pPr>
       <w:r>
         <w:rPr>
           <w:b w:val="0"/>
@@ -197,10 +230,13 @@
           <w:b w:val="0"/>
           <w:i w:val="0"/>
         </w:rPr>
-        <w:t>* ошибок модели</w:t>
+        <w:t xml:space="preserve"> ошибок модели</w:t>
       </w:r>
     </w:p>
     <w:p>
+      <w:pPr>
+        <w:spacing w:after="100" w:line="259" w:lineRule="auto"/>
+      </w:pPr>
       <w:r>
         <w:rPr>
           <w:b w:val="0"/>
@@ -210,6 +246,9 @@
       </w:r>
     </w:p>
     <w:p>
+      <w:pPr>
+        <w:spacing w:after="100" w:line="259" w:lineRule="auto"/>
+      </w:pPr>
       <w:r>
         <w:rPr>
           <w:b/>
@@ -226,6 +265,9 @@
       </w:r>
     </w:p>
     <w:p>
+      <w:pPr>
+        <w:spacing w:after="100" w:line="259" w:lineRule="auto"/>
+      </w:pPr>
       <w:r>
         <w:rPr>
           <w:b w:val="0"/>
@@ -235,6 +277,9 @@
       </w:r>
     </w:p>
     <w:p>
+      <w:pPr>
+        <w:spacing w:after="100" w:line="259" w:lineRule="auto"/>
+      </w:pPr>
       <w:r>
         <w:rPr>
           <w:b w:val="0"/>
@@ -244,6 +289,9 @@
       </w:r>
     </w:p>
     <w:p>
+      <w:pPr>
+        <w:spacing w:after="100" w:line="259" w:lineRule="auto"/>
+      </w:pPr>
       <w:r>
         <w:rPr>
           <w:b/>
@@ -260,6 +308,9 @@
       </w:r>
     </w:p>
     <w:p>
+      <w:pPr>
+        <w:spacing w:after="100" w:line="259" w:lineRule="auto"/>
+      </w:pPr>
       <w:r>
         <w:rPr>
           <w:b w:val="0"/>
@@ -269,6 +320,9 @@
       </w:r>
     </w:p>
     <w:p>
+      <w:pPr>
+        <w:spacing w:after="100" w:line="259" w:lineRule="auto"/>
+      </w:pPr>
       <w:r>
         <w:rPr>
           <w:b w:val="0"/>
@@ -278,6 +332,9 @@
       </w:r>
     </w:p>
     <w:p>
+      <w:pPr>
+        <w:spacing w:after="100" w:line="259" w:lineRule="auto"/>
+      </w:pPr>
       <w:r>
         <w:rPr>
           <w:b w:val="0"/>
@@ -287,6 +344,9 @@
       </w:r>
     </w:p>
     <w:p>
+      <w:pPr>
+        <w:spacing w:after="100" w:line="259" w:lineRule="auto"/>
+      </w:pPr>
       <w:r>
         <w:rPr>
           <w:b w:val="0"/>
@@ -298,6 +358,7 @@
     <w:p>
       <w:pPr>
         <w:pStyle w:val="Heading2"/>
+        <w:spacing w:after="100" w:line="259" w:lineRule="auto"/>
       </w:pPr>
       <w:r>
         <w:rPr>
@@ -312,25 +373,27 @@
         <w:tblStyle w:val="TableGrid"/>
         <w:tblW w:type="auto" w:w="0"/>
         <w:jc w:val="center"/>
+        <w:tblLayout w:type="fixed"/>
         <w:tblLook w:firstColumn="1" w:firstRow="1" w:lastColumn="0" w:lastRow="0" w:noHBand="0" w:noVBand="1" w:val="04A0"/>
       </w:tblPr>
       <w:tblGrid>
-        <w:gridCol w:w="1282"/>
-        <w:gridCol w:w="1282"/>
-        <w:gridCol w:w="1282"/>
-        <w:gridCol w:w="1282"/>
-        <w:gridCol w:w="1282"/>
-        <w:gridCol w:w="1282"/>
-        <w:gridCol w:w="1282"/>
-        <w:gridCol w:w="1282"/>
+        <w:gridCol w:w="2376"/>
+        <w:gridCol w:w="792"/>
+        <w:gridCol w:w="1080"/>
+        <w:gridCol w:w="605"/>
+        <w:gridCol w:w="662"/>
+        <w:gridCol w:w="605"/>
+        <w:gridCol w:w="605"/>
+        <w:gridCol w:w="1080"/>
       </w:tblGrid>
       <w:tr>
         <w:trPr>
           <w:tblHeader w:val="true"/>
+          <w:cantSplit/>
         </w:trPr>
         <w:tc>
           <w:tcPr>
-            <w:tcW w:type="dxa" w:w="1282"/>
+            <w:tcW w:type="dxa" w:w="2376"/>
             <w:shd w:val="clear" w:color="auto" w:fill="EDF2F7"/>
           </w:tcPr>
           <w:p>
@@ -340,12 +403,14 @@
             <w:r>
               <w:rPr>
                 <w:b/>
+                <w:sz w:val="20"/>
               </w:rPr>
             </w:r>
             <w:r>
               <w:rPr>
                 <w:b/>
                 <w:i w:val="0"/>
+                <w:sz w:val="20"/>
               </w:rPr>
               <w:t>Тип данных</w:t>
             </w:r>
@@ -353,7 +418,7 @@
         </w:tc>
         <w:tc>
           <w:tcPr>
-            <w:tcW w:type="dxa" w:w="1282"/>
+            <w:tcW w:type="dxa" w:w="792"/>
             <w:shd w:val="clear" w:color="auto" w:fill="EDF2F7"/>
           </w:tcPr>
           <w:p>
@@ -363,12 +428,14 @@
             <w:r>
               <w:rPr>
                 <w:b/>
+                <w:sz w:val="20"/>
               </w:rPr>
             </w:r>
             <w:r>
               <w:rPr>
                 <w:b/>
                 <w:i w:val="0"/>
+                <w:sz w:val="20"/>
               </w:rPr>
               <w:t>Метка</w:t>
             </w:r>
@@ -376,7 +443,21 @@
         </w:tc>
         <w:tc>
           <w:tcPr>
-            <w:tcW w:type="dxa" w:w="1282"/>
+            <w:tcW w:type="dxa" w:w="1080"/>
+            <w:shd w:val="clear" w:color="auto" w:fill="EDF2F7"/>
+          </w:tcPr>
+          <w:p>
+            <w:r>
+              <w:rPr>
+                <w:b/>
+              </w:rPr>
+              <w:t>p(спам)</w:t>
+            </w:r>
+          </w:p>
+        </w:tc>
+        <w:tc>
+          <w:tcPr>
+            <w:tcW w:type="dxa" w:w="605"/>
             <w:shd w:val="clear" w:color="auto" w:fill="EDF2F7"/>
           </w:tcPr>
           <w:p>
@@ -386,20 +467,22 @@
             <w:r>
               <w:rPr>
                 <w:b/>
+                <w:sz w:val="20"/>
               </w:rPr>
             </w:r>
             <w:r>
               <w:rPr>
                 <w:b/>
                 <w:i w:val="0"/>
+                <w:sz w:val="20"/>
               </w:rPr>
-              <w:t>Вероятность</w:t>
+              <w:t>LR</w:t>
             </w:r>
           </w:p>
         </w:tc>
         <w:tc>
           <w:tcPr>
-            <w:tcW w:type="dxa" w:w="1282"/>
+            <w:tcW w:type="dxa" w:w="662"/>
             <w:shd w:val="clear" w:color="auto" w:fill="EDF2F7"/>
           </w:tcPr>
           <w:p>
@@ -409,20 +492,22 @@
             <w:r>
               <w:rPr>
                 <w:b/>
+                <w:sz w:val="20"/>
               </w:rPr>
             </w:r>
             <w:r>
               <w:rPr>
                 <w:b/>
                 <w:i w:val="0"/>
+                <w:sz w:val="20"/>
               </w:rPr>
-              <w:t>LR</w:t>
+              <w:t>SVM</w:t>
             </w:r>
           </w:p>
         </w:tc>
         <w:tc>
           <w:tcPr>
-            <w:tcW w:type="dxa" w:w="1282"/>
+            <w:tcW w:type="dxa" w:w="605"/>
             <w:shd w:val="clear" w:color="auto" w:fill="EDF2F7"/>
           </w:tcPr>
           <w:p>
@@ -432,20 +517,22 @@
             <w:r>
               <w:rPr>
                 <w:b/>
+                <w:sz w:val="20"/>
               </w:rPr>
             </w:r>
             <w:r>
               <w:rPr>
                 <w:b/>
                 <w:i w:val="0"/>
+                <w:sz w:val="20"/>
               </w:rPr>
-              <w:t>SVM</w:t>
+              <w:t>NB</w:t>
             </w:r>
           </w:p>
         </w:tc>
         <w:tc>
           <w:tcPr>
-            <w:tcW w:type="dxa" w:w="1282"/>
+            <w:tcW w:type="dxa" w:w="605"/>
             <w:shd w:val="clear" w:color="auto" w:fill="EDF2F7"/>
           </w:tcPr>
           <w:p>
@@ -455,20 +542,22 @@
             <w:r>
               <w:rPr>
                 <w:b/>
+                <w:sz w:val="20"/>
               </w:rPr>
             </w:r>
             <w:r>
               <w:rPr>
                 <w:b/>
                 <w:i w:val="0"/>
+                <w:sz w:val="20"/>
               </w:rPr>
-              <w:t>NB</w:t>
+              <w:t>GB</w:t>
             </w:r>
           </w:p>
         </w:tc>
         <w:tc>
           <w:tcPr>
-            <w:tcW w:type="dxa" w:w="1282"/>
+            <w:tcW w:type="dxa" w:w="1080"/>
             <w:shd w:val="clear" w:color="auto" w:fill="EDF2F7"/>
           </w:tcPr>
           <w:p>
@@ -478,21 +567,27 @@
             <w:r>
               <w:rPr>
                 <w:b/>
+                <w:sz w:val="20"/>
               </w:rPr>
             </w:r>
             <w:r>
               <w:rPr>
                 <w:b/>
                 <w:i w:val="0"/>
+                <w:sz w:val="20"/>
               </w:rPr>
-              <w:t>GB</w:t>
+              <w:t>Решение</w:t>
             </w:r>
           </w:p>
         </w:tc>
+      </w:tr>
+      <w:tr>
+        <w:trPr>
+          <w:cantSplit/>
+        </w:trPr>
         <w:tc>
           <w:tcPr>
-            <w:tcW w:type="dxa" w:w="1282"/>
-            <w:shd w:val="clear" w:color="auto" w:fill="EDF2F7"/>
+            <w:tcW w:type="dxa" w:w="2376"/>
           </w:tcPr>
           <w:p>
             <w:pPr>
@@ -500,33 +595,14 @@
             </w:pPr>
             <w:r>
               <w:rPr>
-                <w:b/>
+                <w:sz w:val="20"/>
               </w:rPr>
             </w:r>
             <w:r>
               <w:rPr>
-                <w:b/>
-                <w:i w:val="0"/>
-              </w:rPr>
-              <w:t>Решение</w:t>
-            </w:r>
-          </w:p>
-        </w:tc>
-      </w:tr>
-      <w:tr>
-        <w:tc>
-          <w:tcPr>
-            <w:tcW w:type="dxa" w:w="1282"/>
-          </w:tcPr>
-          <w:p>
-            <w:pPr>
-              <w:spacing w:after="40"/>
-            </w:pPr>
-            <w:r/>
-            <w:r>
-              <w:rPr>
                 <w:b w:val="0"/>
                 <w:i w:val="0"/>
+                <w:sz w:val="20"/>
               </w:rPr>
               <w:t>HTML-письмо</w:t>
             </w:r>
@@ -534,17 +610,22 @@
         </w:tc>
         <w:tc>
           <w:tcPr>
-            <w:tcW w:type="dxa" w:w="1282"/>
+            <w:tcW w:type="dxa" w:w="792"/>
           </w:tcPr>
           <w:p>
             <w:pPr>
               <w:spacing w:after="40"/>
             </w:pPr>
-            <w:r/>
+            <w:r>
+              <w:rPr>
+                <w:sz w:val="20"/>
+              </w:rPr>
+            </w:r>
             <w:r>
               <w:rPr>
                 <w:b w:val="0"/>
                 <w:i w:val="0"/>
+                <w:sz w:val="20"/>
               </w:rPr>
               <w:t>спам</w:t>
             </w:r>
@@ -552,17 +633,22 @@
         </w:tc>
         <w:tc>
           <w:tcPr>
-            <w:tcW w:type="dxa" w:w="1282"/>
+            <w:tcW w:type="dxa" w:w="1080"/>
           </w:tcPr>
           <w:p>
             <w:pPr>
               <w:spacing w:after="40"/>
             </w:pPr>
-            <w:r/>
+            <w:r>
+              <w:rPr>
+                <w:sz w:val="20"/>
+              </w:rPr>
+            </w:r>
             <w:r>
               <w:rPr>
                 <w:b/>
                 <w:i w:val="0"/>
+                <w:sz w:val="20"/>
               </w:rPr>
               <w:t>0.716</w:t>
             </w:r>
@@ -570,17 +656,22 @@
         </w:tc>
         <w:tc>
           <w:tcPr>
-            <w:tcW w:type="dxa" w:w="1282"/>
+            <w:tcW w:type="dxa" w:w="605"/>
           </w:tcPr>
           <w:p>
             <w:pPr>
               <w:spacing w:after="40"/>
             </w:pPr>
-            <w:r/>
+            <w:r>
+              <w:rPr>
+                <w:sz w:val="20"/>
+              </w:rPr>
+            </w:r>
             <w:r>
               <w:rPr>
                 <w:b w:val="0"/>
                 <w:i w:val="0"/>
+                <w:sz w:val="20"/>
               </w:rPr>
               <w:t>0.32</w:t>
             </w:r>
@@ -588,17 +679,22 @@
         </w:tc>
         <w:tc>
           <w:tcPr>
-            <w:tcW w:type="dxa" w:w="1282"/>
+            <w:tcW w:type="dxa" w:w="662"/>
           </w:tcPr>
           <w:p>
             <w:pPr>
               <w:spacing w:after="40"/>
             </w:pPr>
-            <w:r/>
+            <w:r>
+              <w:rPr>
+                <w:sz w:val="20"/>
+              </w:rPr>
+            </w:r>
             <w:r>
               <w:rPr>
                 <w:b w:val="0"/>
                 <w:i w:val="0"/>
+                <w:sz w:val="20"/>
               </w:rPr>
               <w:t>0.21</w:t>
             </w:r>
@@ -606,17 +702,22 @@
         </w:tc>
         <w:tc>
           <w:tcPr>
-            <w:tcW w:type="dxa" w:w="1282"/>
+            <w:tcW w:type="dxa" w:w="605"/>
           </w:tcPr>
           <w:p>
             <w:pPr>
               <w:spacing w:after="40"/>
             </w:pPr>
-            <w:r/>
+            <w:r>
+              <w:rPr>
+                <w:sz w:val="20"/>
+              </w:rPr>
+            </w:r>
             <w:r>
               <w:rPr>
                 <w:b w:val="0"/>
                 <w:i w:val="0"/>
+                <w:sz w:val="20"/>
               </w:rPr>
               <w:t>0.81</w:t>
             </w:r>
@@ -624,17 +725,22 @@
         </w:tc>
         <w:tc>
           <w:tcPr>
-            <w:tcW w:type="dxa" w:w="1282"/>
+            <w:tcW w:type="dxa" w:w="605"/>
           </w:tcPr>
           <w:p>
             <w:pPr>
               <w:spacing w:after="40"/>
             </w:pPr>
-            <w:r/>
+            <w:r>
+              <w:rPr>
+                <w:sz w:val="20"/>
+              </w:rPr>
+            </w:r>
             <w:r>
               <w:rPr>
                 <w:b w:val="0"/>
                 <w:i w:val="0"/>
+                <w:sz w:val="20"/>
               </w:rPr>
               <w:t>0.03</w:t>
             </w:r>
@@ -642,17 +748,22 @@
         </w:tc>
         <w:tc>
           <w:tcPr>
-            <w:tcW w:type="dxa" w:w="1282"/>
+            <w:tcW w:type="dxa" w:w="1080"/>
           </w:tcPr>
           <w:p>
             <w:pPr>
               <w:spacing w:after="40"/>
             </w:pPr>
-            <w:r/>
+            <w:r>
+              <w:rPr>
+                <w:sz w:val="20"/>
+              </w:rPr>
+            </w:r>
             <w:r>
               <w:rPr>
                 <w:b w:val="0"/>
                 <w:i w:val="0"/>
+                <w:sz w:val="20"/>
               </w:rPr>
               <w:t>спам ✓</w:t>
             </w:r>
@@ -660,19 +771,27 @@
         </w:tc>
       </w:tr>
       <w:tr>
+        <w:trPr>
+          <w:cantSplit/>
+        </w:trPr>
         <w:tc>
           <w:tcPr>
-            <w:tcW w:type="dxa" w:w="1282"/>
+            <w:tcW w:type="dxa" w:w="2376"/>
           </w:tcPr>
           <w:p>
             <w:pPr>
               <w:spacing w:after="40"/>
             </w:pPr>
-            <w:r/>
+            <w:r>
+              <w:rPr>
+                <w:sz w:val="20"/>
+              </w:rPr>
+            </w:r>
             <w:r>
               <w:rPr>
                 <w:b w:val="0"/>
                 <w:i w:val="0"/>
+                <w:sz w:val="20"/>
               </w:rPr>
               <w:t>только текст</w:t>
             </w:r>
@@ -680,17 +799,22 @@
         </w:tc>
         <w:tc>
           <w:tcPr>
-            <w:tcW w:type="dxa" w:w="1282"/>
+            <w:tcW w:type="dxa" w:w="792"/>
           </w:tcPr>
           <w:p>
             <w:pPr>
               <w:spacing w:after="40"/>
             </w:pPr>
-            <w:r/>
+            <w:r>
+              <w:rPr>
+                <w:sz w:val="20"/>
+              </w:rPr>
+            </w:r>
             <w:r>
               <w:rPr>
                 <w:b w:val="0"/>
                 <w:i w:val="0"/>
+                <w:sz w:val="20"/>
               </w:rPr>
               <w:t>спам</w:t>
             </w:r>
@@ -698,17 +822,22 @@
         </w:tc>
         <w:tc>
           <w:tcPr>
-            <w:tcW w:type="dxa" w:w="1282"/>
+            <w:tcW w:type="dxa" w:w="1080"/>
           </w:tcPr>
           <w:p>
             <w:pPr>
               <w:spacing w:after="40"/>
             </w:pPr>
-            <w:r/>
+            <w:r>
+              <w:rPr>
+                <w:sz w:val="20"/>
+              </w:rPr>
+            </w:r>
             <w:r>
               <w:rPr>
                 <w:b/>
                 <w:i w:val="0"/>
+                <w:sz w:val="20"/>
               </w:rPr>
               <w:t>0.766</w:t>
             </w:r>
@@ -716,17 +845,22 @@
         </w:tc>
         <w:tc>
           <w:tcPr>
-            <w:tcW w:type="dxa" w:w="1282"/>
+            <w:tcW w:type="dxa" w:w="605"/>
           </w:tcPr>
           <w:p>
             <w:pPr>
               <w:spacing w:after="40"/>
             </w:pPr>
-            <w:r/>
+            <w:r>
+              <w:rPr>
+                <w:sz w:val="20"/>
+              </w:rPr>
+            </w:r>
             <w:r>
               <w:rPr>
                 <w:b w:val="0"/>
                 <w:i w:val="0"/>
+                <w:sz w:val="20"/>
               </w:rPr>
               <w:t>0.64</w:t>
             </w:r>
@@ -734,17 +868,22 @@
         </w:tc>
         <w:tc>
           <w:tcPr>
-            <w:tcW w:type="dxa" w:w="1282"/>
+            <w:tcW w:type="dxa" w:w="662"/>
           </w:tcPr>
           <w:p>
             <w:pPr>
               <w:spacing w:after="40"/>
             </w:pPr>
-            <w:r/>
+            <w:r>
+              <w:rPr>
+                <w:sz w:val="20"/>
+              </w:rPr>
+            </w:r>
             <w:r>
               <w:rPr>
                 <w:b w:val="0"/>
                 <w:i w:val="0"/>
+                <w:sz w:val="20"/>
               </w:rPr>
               <w:t>0.63</w:t>
             </w:r>
@@ -752,17 +891,22 @@
         </w:tc>
         <w:tc>
           <w:tcPr>
-            <w:tcW w:type="dxa" w:w="1282"/>
+            <w:tcW w:type="dxa" w:w="605"/>
           </w:tcPr>
           <w:p>
             <w:pPr>
               <w:spacing w:after="40"/>
             </w:pPr>
-            <w:r/>
+            <w:r>
+              <w:rPr>
+                <w:sz w:val="20"/>
+              </w:rPr>
+            </w:r>
             <w:r>
               <w:rPr>
                 <w:b w:val="0"/>
                 <w:i w:val="0"/>
+                <w:sz w:val="20"/>
               </w:rPr>
               <w:t>0.74</w:t>
             </w:r>
@@ -770,17 +914,22 @@
         </w:tc>
         <w:tc>
           <w:tcPr>
-            <w:tcW w:type="dxa" w:w="1282"/>
+            <w:tcW w:type="dxa" w:w="605"/>
           </w:tcPr>
           <w:p>
             <w:pPr>
               <w:spacing w:after="40"/>
             </w:pPr>
-            <w:r/>
+            <w:r>
+              <w:rPr>
+                <w:sz w:val="20"/>
+              </w:rPr>
+            </w:r>
             <w:r>
               <w:rPr>
                 <w:b w:val="0"/>
                 <w:i w:val="0"/>
+                <w:sz w:val="20"/>
               </w:rPr>
               <w:t>0.33</w:t>
             </w:r>
@@ -788,17 +937,22 @@
         </w:tc>
         <w:tc>
           <w:tcPr>
-            <w:tcW w:type="dxa" w:w="1282"/>
+            <w:tcW w:type="dxa" w:w="1080"/>
           </w:tcPr>
           <w:p>
             <w:pPr>
               <w:spacing w:after="40"/>
             </w:pPr>
-            <w:r/>
+            <w:r>
+              <w:rPr>
+                <w:sz w:val="20"/>
+              </w:rPr>
+            </w:r>
             <w:r>
               <w:rPr>
                 <w:b w:val="0"/>
                 <w:i w:val="0"/>
+                <w:sz w:val="20"/>
               </w:rPr>
               <w:t>спам ✓</w:t>
             </w:r>
@@ -806,19 +960,27 @@
         </w:tc>
       </w:tr>
       <w:tr>
+        <w:trPr>
+          <w:cantSplit/>
+        </w:trPr>
         <w:tc>
           <w:tcPr>
-            <w:tcW w:type="dxa" w:w="1282"/>
+            <w:tcW w:type="dxa" w:w="2376"/>
           </w:tcPr>
           <w:p>
             <w:pPr>
               <w:spacing w:after="40"/>
             </w:pPr>
-            <w:r/>
+            <w:r>
+              <w:rPr>
+                <w:sz w:val="20"/>
+              </w:rPr>
+            </w:r>
             <w:r>
               <w:rPr>
                 <w:b w:val="0"/>
                 <w:i w:val="0"/>
+                <w:sz w:val="20"/>
               </w:rPr>
               <w:t>русский текст</w:t>
             </w:r>
@@ -826,17 +988,22 @@
         </w:tc>
         <w:tc>
           <w:tcPr>
-            <w:tcW w:type="dxa" w:w="1282"/>
+            <w:tcW w:type="dxa" w:w="792"/>
           </w:tcPr>
           <w:p>
             <w:pPr>
               <w:spacing w:after="40"/>
             </w:pPr>
-            <w:r/>
+            <w:r>
+              <w:rPr>
+                <w:sz w:val="20"/>
+              </w:rPr>
+            </w:r>
             <w:r>
               <w:rPr>
                 <w:b w:val="0"/>
                 <w:i w:val="0"/>
+                <w:sz w:val="20"/>
               </w:rPr>
               <w:t>спам</w:t>
             </w:r>
@@ -844,17 +1011,22 @@
         </w:tc>
         <w:tc>
           <w:tcPr>
-            <w:tcW w:type="dxa" w:w="1282"/>
+            <w:tcW w:type="dxa" w:w="1080"/>
           </w:tcPr>
           <w:p>
             <w:pPr>
               <w:spacing w:after="40"/>
             </w:pPr>
-            <w:r/>
+            <w:r>
+              <w:rPr>
+                <w:sz w:val="20"/>
+              </w:rPr>
+            </w:r>
             <w:r>
               <w:rPr>
                 <w:b/>
                 <w:i w:val="0"/>
+                <w:sz w:val="20"/>
               </w:rPr>
               <w:t>0.749</w:t>
             </w:r>
@@ -862,17 +1034,22 @@
         </w:tc>
         <w:tc>
           <w:tcPr>
-            <w:tcW w:type="dxa" w:w="1282"/>
+            <w:tcW w:type="dxa" w:w="605"/>
           </w:tcPr>
           <w:p>
             <w:pPr>
               <w:spacing w:after="40"/>
             </w:pPr>
-            <w:r/>
+            <w:r>
+              <w:rPr>
+                <w:sz w:val="20"/>
+              </w:rPr>
+            </w:r>
             <w:r>
               <w:rPr>
                 <w:b w:val="0"/>
                 <w:i w:val="0"/>
+                <w:sz w:val="20"/>
               </w:rPr>
               <w:t>0.21</w:t>
             </w:r>
@@ -880,17 +1057,22 @@
         </w:tc>
         <w:tc>
           <w:tcPr>
-            <w:tcW w:type="dxa" w:w="1282"/>
+            <w:tcW w:type="dxa" w:w="662"/>
           </w:tcPr>
           <w:p>
             <w:pPr>
               <w:spacing w:after="40"/>
             </w:pPr>
-            <w:r/>
+            <w:r>
+              <w:rPr>
+                <w:sz w:val="20"/>
+              </w:rPr>
+            </w:r>
             <w:r>
               <w:rPr>
                 <w:b w:val="0"/>
                 <w:i w:val="0"/>
+                <w:sz w:val="20"/>
               </w:rPr>
               <w:t>0.06</w:t>
             </w:r>
@@ -898,17 +1080,22 @@
         </w:tc>
         <w:tc>
           <w:tcPr>
-            <w:tcW w:type="dxa" w:w="1282"/>
+            <w:tcW w:type="dxa" w:w="605"/>
           </w:tcPr>
           <w:p>
             <w:pPr>
               <w:spacing w:after="40"/>
             </w:pPr>
-            <w:r/>
+            <w:r>
+              <w:rPr>
+                <w:sz w:val="20"/>
+              </w:rPr>
+            </w:r>
             <w:r>
               <w:rPr>
                 <w:b w:val="0"/>
                 <w:i w:val="0"/>
+                <w:sz w:val="20"/>
               </w:rPr>
               <w:t>0.99</w:t>
             </w:r>
@@ -916,17 +1103,22 @@
         </w:tc>
         <w:tc>
           <w:tcPr>
-            <w:tcW w:type="dxa" w:w="1282"/>
+            <w:tcW w:type="dxa" w:w="605"/>
           </w:tcPr>
           <w:p>
             <w:pPr>
               <w:spacing w:after="40"/>
             </w:pPr>
-            <w:r/>
+            <w:r>
+              <w:rPr>
+                <w:sz w:val="20"/>
+              </w:rPr>
+            </w:r>
             <w:r>
               <w:rPr>
                 <w:b w:val="0"/>
                 <w:i w:val="0"/>
+                <w:sz w:val="20"/>
               </w:rPr>
               <w:t>0.90</w:t>
             </w:r>
@@ -934,17 +1126,22 @@
         </w:tc>
         <w:tc>
           <w:tcPr>
-            <w:tcW w:type="dxa" w:w="1282"/>
+            <w:tcW w:type="dxa" w:w="1080"/>
           </w:tcPr>
           <w:p>
             <w:pPr>
               <w:spacing w:after="40"/>
             </w:pPr>
-            <w:r/>
+            <w:r>
+              <w:rPr>
+                <w:sz w:val="20"/>
+              </w:rPr>
+            </w:r>
             <w:r>
               <w:rPr>
                 <w:b w:val="0"/>
                 <w:i w:val="0"/>
+                <w:sz w:val="20"/>
               </w:rPr>
               <w:t>спам ✓</w:t>
             </w:r>
@@ -952,19 +1149,27 @@
         </w:tc>
       </w:tr>
       <w:tr>
+        <w:trPr>
+          <w:cantSplit/>
+        </w:trPr>
         <w:tc>
           <w:tcPr>
-            <w:tcW w:type="dxa" w:w="1282"/>
+            <w:tcW w:type="dxa" w:w="2376"/>
           </w:tcPr>
           <w:p>
             <w:pPr>
               <w:spacing w:after="40"/>
             </w:pPr>
-            <w:r/>
+            <w:r>
+              <w:rPr>
+                <w:sz w:val="20"/>
+              </w:rPr>
+            </w:r>
             <w:r>
               <w:rPr>
                 <w:b w:val="0"/>
                 <w:i w:val="0"/>
+                <w:sz w:val="20"/>
               </w:rPr>
               <w:t>английский текст</w:t>
             </w:r>
@@ -972,17 +1177,22 @@
         </w:tc>
         <w:tc>
           <w:tcPr>
-            <w:tcW w:type="dxa" w:w="1282"/>
+            <w:tcW w:type="dxa" w:w="792"/>
           </w:tcPr>
           <w:p>
             <w:pPr>
               <w:spacing w:after="40"/>
             </w:pPr>
-            <w:r/>
+            <w:r>
+              <w:rPr>
+                <w:sz w:val="20"/>
+              </w:rPr>
+            </w:r>
             <w:r>
               <w:rPr>
                 <w:b w:val="0"/>
                 <w:i w:val="0"/>
+                <w:sz w:val="20"/>
               </w:rPr>
               <w:t>спам</w:t>
             </w:r>
@@ -990,17 +1200,22 @@
         </w:tc>
         <w:tc>
           <w:tcPr>
-            <w:tcW w:type="dxa" w:w="1282"/>
+            <w:tcW w:type="dxa" w:w="1080"/>
           </w:tcPr>
           <w:p>
             <w:pPr>
               <w:spacing w:after="40"/>
             </w:pPr>
-            <w:r/>
+            <w:r>
+              <w:rPr>
+                <w:sz w:val="20"/>
+              </w:rPr>
+            </w:r>
             <w:r>
               <w:rPr>
                 <w:b/>
                 <w:i w:val="0"/>
+                <w:sz w:val="20"/>
               </w:rPr>
               <w:t>0.704</w:t>
             </w:r>
@@ -1008,17 +1223,22 @@
         </w:tc>
         <w:tc>
           <w:tcPr>
-            <w:tcW w:type="dxa" w:w="1282"/>
+            <w:tcW w:type="dxa" w:w="605"/>
           </w:tcPr>
           <w:p>
             <w:pPr>
               <w:spacing w:after="40"/>
             </w:pPr>
-            <w:r/>
+            <w:r>
+              <w:rPr>
+                <w:sz w:val="20"/>
+              </w:rPr>
+            </w:r>
             <w:r>
               <w:rPr>
                 <w:b w:val="0"/>
                 <w:i w:val="0"/>
+                <w:sz w:val="20"/>
               </w:rPr>
               <w:t>0.78</w:t>
             </w:r>
@@ -1026,17 +1246,22 @@
         </w:tc>
         <w:tc>
           <w:tcPr>
-            <w:tcW w:type="dxa" w:w="1282"/>
+            <w:tcW w:type="dxa" w:w="662"/>
           </w:tcPr>
           <w:p>
             <w:pPr>
               <w:spacing w:after="40"/>
             </w:pPr>
-            <w:r/>
+            <w:r>
+              <w:rPr>
+                <w:sz w:val="20"/>
+              </w:rPr>
+            </w:r>
             <w:r>
               <w:rPr>
                 <w:b w:val="0"/>
                 <w:i w:val="0"/>
+                <w:sz w:val="20"/>
               </w:rPr>
               <w:t>0.85</w:t>
             </w:r>
@@ -1044,17 +1269,22 @@
         </w:tc>
         <w:tc>
           <w:tcPr>
-            <w:tcW w:type="dxa" w:w="1282"/>
+            <w:tcW w:type="dxa" w:w="605"/>
           </w:tcPr>
           <w:p>
             <w:pPr>
               <w:spacing w:after="40"/>
             </w:pPr>
-            <w:r/>
+            <w:r>
+              <w:rPr>
+                <w:sz w:val="20"/>
+              </w:rPr>
+            </w:r>
             <w:r>
               <w:rPr>
                 <w:b w:val="0"/>
                 <w:i w:val="0"/>
+                <w:sz w:val="20"/>
               </w:rPr>
               <w:t>0.89</w:t>
             </w:r>
@@ -1062,17 +1292,22 @@
         </w:tc>
         <w:tc>
           <w:tcPr>
-            <w:tcW w:type="dxa" w:w="1282"/>
+            <w:tcW w:type="dxa" w:w="605"/>
           </w:tcPr>
           <w:p>
             <w:pPr>
               <w:spacing w:after="40"/>
             </w:pPr>
-            <w:r/>
+            <w:r>
+              <w:rPr>
+                <w:sz w:val="20"/>
+              </w:rPr>
+            </w:r>
             <w:r>
               <w:rPr>
                 <w:b w:val="0"/>
                 <w:i w:val="0"/>
+                <w:sz w:val="20"/>
               </w:rPr>
               <w:t>0.77</w:t>
             </w:r>
@@ -1080,17 +1315,22 @@
         </w:tc>
         <w:tc>
           <w:tcPr>
-            <w:tcW w:type="dxa" w:w="1282"/>
+            <w:tcW w:type="dxa" w:w="1080"/>
           </w:tcPr>
           <w:p>
             <w:pPr>
               <w:spacing w:after="40"/>
             </w:pPr>
-            <w:r/>
+            <w:r>
+              <w:rPr>
+                <w:sz w:val="20"/>
+              </w:rPr>
+            </w:r>
             <w:r>
               <w:rPr>
                 <w:b w:val="0"/>
                 <w:i w:val="0"/>
+                <w:sz w:val="20"/>
               </w:rPr>
               <w:t>норма ✗</w:t>
             </w:r>
@@ -1098,19 +1338,27 @@
         </w:tc>
       </w:tr>
       <w:tr>
+        <w:trPr>
+          <w:cantSplit/>
+        </w:trPr>
         <w:tc>
           <w:tcPr>
-            <w:tcW w:type="dxa" w:w="1282"/>
+            <w:tcW w:type="dxa" w:w="2376"/>
           </w:tcPr>
           <w:p>
             <w:pPr>
               <w:spacing w:after="40"/>
             </w:pPr>
-            <w:r/>
+            <w:r>
+              <w:rPr>
+                <w:sz w:val="20"/>
+              </w:rPr>
+            </w:r>
             <w:r>
               <w:rPr>
                 <w:b w:val="0"/>
                 <w:i w:val="0"/>
+                <w:sz w:val="20"/>
               </w:rPr>
               <w:t>очень короткое (&lt; 400 символов)</w:t>
             </w:r>
@@ -1118,17 +1366,22 @@
         </w:tc>
         <w:tc>
           <w:tcPr>
-            <w:tcW w:type="dxa" w:w="1282"/>
+            <w:tcW w:type="dxa" w:w="792"/>
           </w:tcPr>
           <w:p>
             <w:pPr>
               <w:spacing w:after="40"/>
             </w:pPr>
-            <w:r/>
+            <w:r>
+              <w:rPr>
+                <w:sz w:val="20"/>
+              </w:rPr>
+            </w:r>
             <w:r>
               <w:rPr>
                 <w:b w:val="0"/>
                 <w:i w:val="0"/>
+                <w:sz w:val="20"/>
               </w:rPr>
               <w:t>спам</w:t>
             </w:r>
@@ -1136,17 +1389,22 @@
         </w:tc>
         <w:tc>
           <w:tcPr>
-            <w:tcW w:type="dxa" w:w="1282"/>
+            <w:tcW w:type="dxa" w:w="1080"/>
           </w:tcPr>
           <w:p>
             <w:pPr>
               <w:spacing w:after="40"/>
             </w:pPr>
-            <w:r/>
+            <w:r>
+              <w:rPr>
+                <w:sz w:val="20"/>
+              </w:rPr>
+            </w:r>
             <w:r>
               <w:rPr>
                 <w:b/>
                 <w:i w:val="0"/>
+                <w:sz w:val="20"/>
               </w:rPr>
               <w:t>0.696</w:t>
             </w:r>
@@ -1154,17 +1412,22 @@
         </w:tc>
         <w:tc>
           <w:tcPr>
-            <w:tcW w:type="dxa" w:w="1282"/>
+            <w:tcW w:type="dxa" w:w="605"/>
           </w:tcPr>
           <w:p>
             <w:pPr>
               <w:spacing w:after="40"/>
             </w:pPr>
-            <w:r/>
+            <w:r>
+              <w:rPr>
+                <w:sz w:val="20"/>
+              </w:rPr>
+            </w:r>
             <w:r>
               <w:rPr>
                 <w:b w:val="0"/>
                 <w:i w:val="0"/>
+                <w:sz w:val="20"/>
               </w:rPr>
               <w:t>0.68</w:t>
             </w:r>
@@ -1172,17 +1435,22 @@
         </w:tc>
         <w:tc>
           <w:tcPr>
-            <w:tcW w:type="dxa" w:w="1282"/>
+            <w:tcW w:type="dxa" w:w="662"/>
           </w:tcPr>
           <w:p>
             <w:pPr>
               <w:spacing w:after="40"/>
             </w:pPr>
-            <w:r/>
+            <w:r>
+              <w:rPr>
+                <w:sz w:val="20"/>
+              </w:rPr>
+            </w:r>
             <w:r>
               <w:rPr>
                 <w:b w:val="0"/>
                 <w:i w:val="0"/>
+                <w:sz w:val="20"/>
               </w:rPr>
               <w:t>0.70</w:t>
             </w:r>
@@ -1190,17 +1458,22 @@
         </w:tc>
         <w:tc>
           <w:tcPr>
-            <w:tcW w:type="dxa" w:w="1282"/>
+            <w:tcW w:type="dxa" w:w="605"/>
           </w:tcPr>
           <w:p>
             <w:pPr>
               <w:spacing w:after="40"/>
             </w:pPr>
-            <w:r/>
+            <w:r>
+              <w:rPr>
+                <w:sz w:val="20"/>
+              </w:rPr>
+            </w:r>
             <w:r>
               <w:rPr>
                 <w:b w:val="0"/>
                 <w:i w:val="0"/>
+                <w:sz w:val="20"/>
               </w:rPr>
               <w:t>0.37</w:t>
             </w:r>
@@ -1208,17 +1481,22 @@
         </w:tc>
         <w:tc>
           <w:tcPr>
-            <w:tcW w:type="dxa" w:w="1282"/>
+            <w:tcW w:type="dxa" w:w="605"/>
           </w:tcPr>
           <w:p>
             <w:pPr>
               <w:spacing w:after="40"/>
             </w:pPr>
-            <w:r/>
+            <w:r>
+              <w:rPr>
+                <w:sz w:val="20"/>
+              </w:rPr>
+            </w:r>
             <w:r>
               <w:rPr>
                 <w:b w:val="0"/>
                 <w:i w:val="0"/>
+                <w:sz w:val="20"/>
               </w:rPr>
               <w:t>0.99</w:t>
             </w:r>
@@ -1226,17 +1504,22 @@
         </w:tc>
         <w:tc>
           <w:tcPr>
-            <w:tcW w:type="dxa" w:w="1282"/>
+            <w:tcW w:type="dxa" w:w="1080"/>
           </w:tcPr>
           <w:p>
             <w:pPr>
               <w:spacing w:after="40"/>
             </w:pPr>
-            <w:r/>
+            <w:r>
+              <w:rPr>
+                <w:sz w:val="20"/>
+              </w:rPr>
+            </w:r>
             <w:r>
               <w:rPr>
                 <w:b w:val="0"/>
                 <w:i w:val="0"/>
+                <w:sz w:val="20"/>
               </w:rPr>
               <w:t>норма ✗</w:t>
             </w:r>
@@ -1244,19 +1527,27 @@
         </w:tc>
       </w:tr>
       <w:tr>
+        <w:trPr>
+          <w:cantSplit/>
+        </w:trPr>
         <w:tc>
           <w:tcPr>
-            <w:tcW w:type="dxa" w:w="1282"/>
+            <w:tcW w:type="dxa" w:w="2376"/>
           </w:tcPr>
           <w:p>
             <w:pPr>
               <w:spacing w:after="40"/>
             </w:pPr>
-            <w:r/>
+            <w:r>
+              <w:rPr>
+                <w:sz w:val="20"/>
+              </w:rPr>
+            </w:r>
             <w:r>
               <w:rPr>
                 <w:b w:val="0"/>
                 <w:i w:val="0"/>
+                <w:sz w:val="20"/>
               </w:rPr>
               <w:t>длинное (&gt; 4000 символов)</w:t>
             </w:r>
@@ -1264,17 +1555,22 @@
         </w:tc>
         <w:tc>
           <w:tcPr>
-            <w:tcW w:type="dxa" w:w="1282"/>
+            <w:tcW w:type="dxa" w:w="792"/>
           </w:tcPr>
           <w:p>
             <w:pPr>
               <w:spacing w:after="40"/>
             </w:pPr>
-            <w:r/>
+            <w:r>
+              <w:rPr>
+                <w:sz w:val="20"/>
+              </w:rPr>
+            </w:r>
             <w:r>
               <w:rPr>
                 <w:b w:val="0"/>
                 <w:i w:val="0"/>
+                <w:sz w:val="20"/>
               </w:rPr>
               <w:t>спам</w:t>
             </w:r>
@@ -1282,17 +1578,22 @@
         </w:tc>
         <w:tc>
           <w:tcPr>
-            <w:tcW w:type="dxa" w:w="1282"/>
+            <w:tcW w:type="dxa" w:w="1080"/>
           </w:tcPr>
           <w:p>
             <w:pPr>
               <w:spacing w:after="40"/>
             </w:pPr>
-            <w:r/>
+            <w:r>
+              <w:rPr>
+                <w:sz w:val="20"/>
+              </w:rPr>
+            </w:r>
             <w:r>
               <w:rPr>
                 <w:b/>
                 <w:i w:val="0"/>
+                <w:sz w:val="20"/>
               </w:rPr>
               <w:t>0.740</w:t>
             </w:r>
@@ -1300,17 +1601,22 @@
         </w:tc>
         <w:tc>
           <w:tcPr>
-            <w:tcW w:type="dxa" w:w="1282"/>
+            <w:tcW w:type="dxa" w:w="605"/>
           </w:tcPr>
           <w:p>
             <w:pPr>
               <w:spacing w:after="40"/>
             </w:pPr>
-            <w:r/>
+            <w:r>
+              <w:rPr>
+                <w:sz w:val="20"/>
+              </w:rPr>
+            </w:r>
             <w:r>
               <w:rPr>
                 <w:b w:val="0"/>
                 <w:i w:val="0"/>
+                <w:sz w:val="20"/>
               </w:rPr>
               <w:t>0.68</w:t>
             </w:r>
@@ -1318,17 +1624,22 @@
         </w:tc>
         <w:tc>
           <w:tcPr>
-            <w:tcW w:type="dxa" w:w="1282"/>
+            <w:tcW w:type="dxa" w:w="662"/>
           </w:tcPr>
           <w:p>
             <w:pPr>
               <w:spacing w:after="40"/>
             </w:pPr>
-            <w:r/>
+            <w:r>
+              <w:rPr>
+                <w:sz w:val="20"/>
+              </w:rPr>
+            </w:r>
             <w:r>
               <w:rPr>
                 <w:b w:val="0"/>
                 <w:i w:val="0"/>
+                <w:sz w:val="20"/>
               </w:rPr>
               <w:t>0.70</w:t>
             </w:r>
@@ -1336,17 +1647,22 @@
         </w:tc>
         <w:tc>
           <w:tcPr>
-            <w:tcW w:type="dxa" w:w="1282"/>
+            <w:tcW w:type="dxa" w:w="605"/>
           </w:tcPr>
           <w:p>
             <w:pPr>
               <w:spacing w:after="40"/>
             </w:pPr>
-            <w:r/>
+            <w:r>
+              <w:rPr>
+                <w:sz w:val="20"/>
+              </w:rPr>
+            </w:r>
             <w:r>
               <w:rPr>
                 <w:b w:val="0"/>
                 <w:i w:val="0"/>
+                <w:sz w:val="20"/>
               </w:rPr>
               <w:t>0.99</w:t>
             </w:r>
@@ -1354,17 +1670,22 @@
         </w:tc>
         <w:tc>
           <w:tcPr>
-            <w:tcW w:type="dxa" w:w="1282"/>
+            <w:tcW w:type="dxa" w:w="605"/>
           </w:tcPr>
           <w:p>
             <w:pPr>
               <w:spacing w:after="40"/>
             </w:pPr>
-            <w:r/>
+            <w:r>
+              <w:rPr>
+                <w:sz w:val="20"/>
+              </w:rPr>
+            </w:r>
             <w:r>
               <w:rPr>
                 <w:b w:val="0"/>
                 <w:i w:val="0"/>
+                <w:sz w:val="20"/>
               </w:rPr>
               <w:t>0.94</w:t>
             </w:r>
@@ -1372,17 +1693,22 @@
         </w:tc>
         <w:tc>
           <w:tcPr>
-            <w:tcW w:type="dxa" w:w="1282"/>
+            <w:tcW w:type="dxa" w:w="1080"/>
           </w:tcPr>
           <w:p>
             <w:pPr>
               <w:spacing w:after="40"/>
             </w:pPr>
-            <w:r/>
+            <w:r>
+              <w:rPr>
+                <w:sz w:val="20"/>
+              </w:rPr>
+            </w:r>
             <w:r>
               <w:rPr>
                 <w:b w:val="0"/>
                 <w:i w:val="0"/>
+                <w:sz w:val="20"/>
               </w:rPr>
               <w:t>спам ✓</w:t>
             </w:r>
@@ -1390,19 +1716,27 @@
         </w:tc>
       </w:tr>
       <w:tr>
+        <w:trPr>
+          <w:cantSplit/>
+        </w:trPr>
         <w:tc>
           <w:tcPr>
-            <w:tcW w:type="dxa" w:w="1282"/>
+            <w:tcW w:type="dxa" w:w="2376"/>
           </w:tcPr>
           <w:p>
             <w:pPr>
               <w:spacing w:after="40"/>
             </w:pPr>
-            <w:r/>
+            <w:r>
+              <w:rPr>
+                <w:sz w:val="20"/>
+              </w:rPr>
+            </w:r>
             <w:r>
               <w:rPr>
                 <w:b w:val="0"/>
                 <w:i w:val="0"/>
+                <w:sz w:val="20"/>
               </w:rPr>
               <w:t>без темы</w:t>
             </w:r>
@@ -1410,17 +1744,22 @@
         </w:tc>
         <w:tc>
           <w:tcPr>
-            <w:tcW w:type="dxa" w:w="1282"/>
+            <w:tcW w:type="dxa" w:w="792"/>
           </w:tcPr>
           <w:p>
             <w:pPr>
               <w:spacing w:after="40"/>
             </w:pPr>
-            <w:r/>
+            <w:r>
+              <w:rPr>
+                <w:sz w:val="20"/>
+              </w:rPr>
+            </w:r>
             <w:r>
               <w:rPr>
                 <w:b w:val="0"/>
                 <w:i w:val="0"/>
+                <w:sz w:val="20"/>
               </w:rPr>
               <w:t>спам</w:t>
             </w:r>
@@ -1428,17 +1767,22 @@
         </w:tc>
         <w:tc>
           <w:tcPr>
-            <w:tcW w:type="dxa" w:w="1282"/>
+            <w:tcW w:type="dxa" w:w="1080"/>
           </w:tcPr>
           <w:p>
             <w:pPr>
               <w:spacing w:after="40"/>
             </w:pPr>
-            <w:r/>
+            <w:r>
+              <w:rPr>
+                <w:sz w:val="20"/>
+              </w:rPr>
+            </w:r>
             <w:r>
               <w:rPr>
                 <w:b/>
                 <w:i w:val="0"/>
+                <w:sz w:val="20"/>
               </w:rPr>
               <w:t>0.978</w:t>
             </w:r>
@@ -1446,17 +1790,22 @@
         </w:tc>
         <w:tc>
           <w:tcPr>
-            <w:tcW w:type="dxa" w:w="1282"/>
+            <w:tcW w:type="dxa" w:w="605"/>
           </w:tcPr>
           <w:p>
             <w:pPr>
               <w:spacing w:after="40"/>
             </w:pPr>
-            <w:r/>
+            <w:r>
+              <w:rPr>
+                <w:sz w:val="20"/>
+              </w:rPr>
+            </w:r>
             <w:r>
               <w:rPr>
                 <w:b w:val="0"/>
                 <w:i w:val="0"/>
+                <w:sz w:val="20"/>
               </w:rPr>
               <w:t>0.60</w:t>
             </w:r>
@@ -1464,17 +1813,22 @@
         </w:tc>
         <w:tc>
           <w:tcPr>
-            <w:tcW w:type="dxa" w:w="1282"/>
+            <w:tcW w:type="dxa" w:w="662"/>
           </w:tcPr>
           <w:p>
             <w:pPr>
               <w:spacing w:after="40"/>
             </w:pPr>
-            <w:r/>
+            <w:r>
+              <w:rPr>
+                <w:sz w:val="20"/>
+              </w:rPr>
+            </w:r>
             <w:r>
               <w:rPr>
                 <w:b w:val="0"/>
                 <w:i w:val="0"/>
+                <w:sz w:val="20"/>
               </w:rPr>
               <w:t>0.56</w:t>
             </w:r>
@@ -1482,17 +1836,22 @@
         </w:tc>
         <w:tc>
           <w:tcPr>
-            <w:tcW w:type="dxa" w:w="1282"/>
+            <w:tcW w:type="dxa" w:w="605"/>
           </w:tcPr>
           <w:p>
             <w:pPr>
               <w:spacing w:after="40"/>
             </w:pPr>
-            <w:r/>
+            <w:r>
+              <w:rPr>
+                <w:sz w:val="20"/>
+              </w:rPr>
+            </w:r>
             <w:r>
               <w:rPr>
                 <w:b w:val="0"/>
                 <w:i w:val="0"/>
+                <w:sz w:val="20"/>
               </w:rPr>
               <w:t>1.00</w:t>
             </w:r>
@@ -1500,17 +1859,22 @@
         </w:tc>
         <w:tc>
           <w:tcPr>
-            <w:tcW w:type="dxa" w:w="1282"/>
+            <w:tcW w:type="dxa" w:w="605"/>
           </w:tcPr>
           <w:p>
             <w:pPr>
               <w:spacing w:after="40"/>
             </w:pPr>
-            <w:r/>
+            <w:r>
+              <w:rPr>
+                <w:sz w:val="20"/>
+              </w:rPr>
+            </w:r>
             <w:r>
               <w:rPr>
                 <w:b w:val="0"/>
                 <w:i w:val="0"/>
+                <w:sz w:val="20"/>
               </w:rPr>
               <w:t>0.14</w:t>
             </w:r>
@@ -1518,17 +1882,22 @@
         </w:tc>
         <w:tc>
           <w:tcPr>
-            <w:tcW w:type="dxa" w:w="1282"/>
+            <w:tcW w:type="dxa" w:w="1080"/>
           </w:tcPr>
           <w:p>
             <w:pPr>
               <w:spacing w:after="40"/>
             </w:pPr>
-            <w:r/>
+            <w:r>
+              <w:rPr>
+                <w:sz w:val="20"/>
+              </w:rPr>
+            </w:r>
             <w:r>
               <w:rPr>
                 <w:b w:val="0"/>
                 <w:i w:val="0"/>
+                <w:sz w:val="20"/>
               </w:rPr>
               <w:t>спам ✓</w:t>
             </w:r>
@@ -1536,19 +1905,27 @@
         </w:tc>
       </w:tr>
       <w:tr>
+        <w:trPr>
+          <w:cantSplit/>
+        </w:trPr>
         <w:tc>
           <w:tcPr>
-            <w:tcW w:type="dxa" w:w="1282"/>
+            <w:tcW w:type="dxa" w:w="2376"/>
           </w:tcPr>
           <w:p>
             <w:pPr>
               <w:spacing w:after="40"/>
             </w:pPr>
-            <w:r/>
+            <w:r>
+              <w:rPr>
+                <w:sz w:val="20"/>
+              </w:rPr>
+            </w:r>
             <w:r>
               <w:rPr>
                 <w:b w:val="0"/>
                 <w:i w:val="0"/>
+                <w:sz w:val="20"/>
               </w:rPr>
               <w:t>с вложением</w:t>
             </w:r>
@@ -1556,17 +1933,22 @@
         </w:tc>
         <w:tc>
           <w:tcPr>
-            <w:tcW w:type="dxa" w:w="1282"/>
+            <w:tcW w:type="dxa" w:w="792"/>
           </w:tcPr>
           <w:p>
             <w:pPr>
               <w:spacing w:after="40"/>
             </w:pPr>
-            <w:r/>
+            <w:r>
+              <w:rPr>
+                <w:sz w:val="20"/>
+              </w:rPr>
+            </w:r>
             <w:r>
               <w:rPr>
                 <w:b w:val="0"/>
                 <w:i w:val="0"/>
+                <w:sz w:val="20"/>
               </w:rPr>
               <w:t>спам</w:t>
             </w:r>
@@ -1574,17 +1956,22 @@
         </w:tc>
         <w:tc>
           <w:tcPr>
-            <w:tcW w:type="dxa" w:w="1282"/>
+            <w:tcW w:type="dxa" w:w="1080"/>
           </w:tcPr>
           <w:p>
             <w:pPr>
               <w:spacing w:after="40"/>
             </w:pPr>
-            <w:r/>
+            <w:r>
+              <w:rPr>
+                <w:sz w:val="20"/>
+              </w:rPr>
+            </w:r>
             <w:r>
               <w:rPr>
                 <w:b/>
                 <w:i w:val="0"/>
+                <w:sz w:val="20"/>
               </w:rPr>
               <w:t>0.784</w:t>
             </w:r>
@@ -1592,17 +1979,22 @@
         </w:tc>
         <w:tc>
           <w:tcPr>
-            <w:tcW w:type="dxa" w:w="1282"/>
+            <w:tcW w:type="dxa" w:w="605"/>
           </w:tcPr>
           <w:p>
             <w:pPr>
               <w:spacing w:after="40"/>
             </w:pPr>
-            <w:r/>
+            <w:r>
+              <w:rPr>
+                <w:sz w:val="20"/>
+              </w:rPr>
+            </w:r>
             <w:r>
               <w:rPr>
                 <w:b w:val="0"/>
                 <w:i w:val="0"/>
+                <w:sz w:val="20"/>
               </w:rPr>
               <w:t>0.12</w:t>
             </w:r>
@@ -1610,17 +2002,22 @@
         </w:tc>
         <w:tc>
           <w:tcPr>
-            <w:tcW w:type="dxa" w:w="1282"/>
+            <w:tcW w:type="dxa" w:w="662"/>
           </w:tcPr>
           <w:p>
             <w:pPr>
               <w:spacing w:after="40"/>
             </w:pPr>
-            <w:r/>
+            <w:r>
+              <w:rPr>
+                <w:sz w:val="20"/>
+              </w:rPr>
+            </w:r>
             <w:r>
               <w:rPr>
                 <w:b w:val="0"/>
                 <w:i w:val="0"/>
+                <w:sz w:val="20"/>
               </w:rPr>
               <w:t>0.03</w:t>
             </w:r>
@@ -1628,17 +2025,22 @@
         </w:tc>
         <w:tc>
           <w:tcPr>
-            <w:tcW w:type="dxa" w:w="1282"/>
+            <w:tcW w:type="dxa" w:w="605"/>
           </w:tcPr>
           <w:p>
             <w:pPr>
               <w:spacing w:after="40"/>
             </w:pPr>
-            <w:r/>
+            <w:r>
+              <w:rPr>
+                <w:sz w:val="20"/>
+              </w:rPr>
+            </w:r>
             <w:r>
               <w:rPr>
                 <w:b w:val="0"/>
                 <w:i w:val="0"/>
+                <w:sz w:val="20"/>
               </w:rPr>
               <w:t>0.36</w:t>
             </w:r>
@@ -1646,17 +2048,22 @@
         </w:tc>
         <w:tc>
           <w:tcPr>
-            <w:tcW w:type="dxa" w:w="1282"/>
+            <w:tcW w:type="dxa" w:w="605"/>
           </w:tcPr>
           <w:p>
             <w:pPr>
               <w:spacing w:after="40"/>
             </w:pPr>
-            <w:r/>
+            <w:r>
+              <w:rPr>
+                <w:sz w:val="20"/>
+              </w:rPr>
+            </w:r>
             <w:r>
               <w:rPr>
                 <w:b w:val="0"/>
                 <w:i w:val="0"/>
+                <w:sz w:val="20"/>
               </w:rPr>
               <w:t>0.68</w:t>
             </w:r>
@@ -1664,17 +2071,22 @@
         </w:tc>
         <w:tc>
           <w:tcPr>
-            <w:tcW w:type="dxa" w:w="1282"/>
+            <w:tcW w:type="dxa" w:w="1080"/>
           </w:tcPr>
           <w:p>
             <w:pPr>
               <w:spacing w:after="40"/>
             </w:pPr>
-            <w:r/>
+            <w:r>
+              <w:rPr>
+                <w:sz w:val="20"/>
+              </w:rPr>
+            </w:r>
             <w:r>
               <w:rPr>
                 <w:b w:val="0"/>
                 <w:i w:val="0"/>
+                <w:sz w:val="20"/>
               </w:rPr>
               <w:t>спам ✓</w:t>
             </w:r>
@@ -1682,8 +2094,15 @@
         </w:tc>
       </w:tr>
     </w:tbl>
-    <w:p/>
     <w:p>
+      <w:pPr>
+        <w:spacing w:after="100" w:line="259" w:lineRule="auto"/>
+      </w:pPr>
+    </w:p>
+    <w:p>
+      <w:pPr>
+        <w:spacing w:after="100" w:line="259" w:lineRule="auto"/>
+      </w:pPr>
       <w:r>
         <w:rPr>
           <w:b w:val="0"/>
@@ -1693,6 +2112,9 @@
       </w:r>
     </w:p>
     <w:p>
+      <w:pPr>
+        <w:spacing w:after="100" w:line="259" w:lineRule="auto"/>
+      </w:pPr>
       <w:r>
         <w:rPr>
           <w:b w:val="0"/>
@@ -1712,10 +2134,13 @@
           <w:b w:val="0"/>
           <w:i w:val="0"/>
         </w:rPr>
-        <w:t>* — за спам только NB (разброс 0.78), остальные против; итог — спам.</w:t>
+        <w:t xml:space="preserve"> — за спам только NB (разброс 0.78), остальные против; итог — спам.</w:t>
       </w:r>
     </w:p>
     <w:p>
+      <w:pPr>
+        <w:spacing w:after="100" w:line="259" w:lineRule="auto"/>
+      </w:pPr>
       <w:r>
         <w:rPr>
           <w:b w:val="0"/>
@@ -1735,10 +2160,13 @@
           <w:b w:val="0"/>
           <w:i w:val="0"/>
         </w:rPr>
-        <w:t>* — за спам только NB (разброс 0.41), остальные против; итог — спам.</w:t>
+        <w:t xml:space="preserve"> — за спам только NB (разброс 0.41), остальные против; итог — спам.</w:t>
       </w:r>
     </w:p>
     <w:p>
+      <w:pPr>
+        <w:spacing w:after="100" w:line="259" w:lineRule="auto"/>
+      </w:pPr>
       <w:r>
         <w:rPr>
           <w:b w:val="0"/>
@@ -1758,10 +2186,13 @@
           <w:b w:val="0"/>
           <w:i w:val="0"/>
         </w:rPr>
-        <w:t>* — голоса разделились 2:2 (разброс 0.93): словарные модели и бустинг смотрят на разные признаки; итог — спам.</w:t>
+        <w:t xml:space="preserve"> — голоса разделились 2:2 (разброс 0.93): словарные модели и бустинг смотрят на разные признаки; итог — спам.</w:t>
       </w:r>
     </w:p>
     <w:p>
+      <w:pPr>
+        <w:spacing w:after="100" w:line="259" w:lineRule="auto"/>
+      </w:pPr>
       <w:r>
         <w:rPr>
           <w:b w:val="0"/>
@@ -1781,10 +2212,13 @@
           <w:b w:val="0"/>
           <w:i w:val="0"/>
         </w:rPr>
-        <w:t>* — все четыре модели за спам, но мета-модель опустила итог до 0.704 (порог 0.71); итог — норма.</w:t>
+        <w:t xml:space="preserve"> — все четыре модели за спам, но мета-модель опустила итог до 0.704 (порог 0.71); итог — норма.</w:t>
       </w:r>
     </w:p>
     <w:p>
+      <w:pPr>
+        <w:spacing w:after="100" w:line="259" w:lineRule="auto"/>
+      </w:pPr>
       <w:r>
         <w:rPr>
           <w:b w:val="0"/>
@@ -1804,10 +2238,13 @@
           <w:b w:val="0"/>
           <w:i w:val="0"/>
         </w:rPr>
-        <w:t>* — за спам только GB (разброс 0.62), остальные против; итог — норма.</w:t>
+        <w:t xml:space="preserve"> — за спам только GB (разброс 0.62), остальные против; итог — норма.</w:t>
       </w:r>
     </w:p>
     <w:p>
+      <w:pPr>
+        <w:spacing w:after="100" w:line="259" w:lineRule="auto"/>
+      </w:pPr>
       <w:r>
         <w:rPr>
           <w:b w:val="0"/>
@@ -1827,10 +2264,13 @@
           <w:b w:val="0"/>
           <w:i w:val="0"/>
         </w:rPr>
-        <w:t>* — голоса разделились 2:2 (разброс 0.31): словарные модели и бустинг смотрят на разные признаки; итог — спам.</w:t>
+        <w:t xml:space="preserve"> — голоса разделились 2:2 (разброс 0.31): словарные модели и бустинг смотрят на разные признаки; итог — спам.</w:t>
       </w:r>
     </w:p>
     <w:p>
+      <w:pPr>
+        <w:spacing w:after="100" w:line="259" w:lineRule="auto"/>
+      </w:pPr>
       <w:r>
         <w:rPr>
           <w:b w:val="0"/>
@@ -1850,10 +2290,13 @@
           <w:b w:val="0"/>
           <w:i w:val="0"/>
         </w:rPr>
-        <w:t>* — за спам только NB (разброс 0.86), остальные против; итог — спам.</w:t>
+        <w:t xml:space="preserve"> — за спам только NB (разброс 0.86), остальные против; итог — спам.</w:t>
       </w:r>
     </w:p>
     <w:p>
+      <w:pPr>
+        <w:spacing w:after="100" w:line="259" w:lineRule="auto"/>
+      </w:pPr>
       <w:r>
         <w:rPr>
           <w:b w:val="0"/>
@@ -1873,12 +2316,13 @@
           <w:b w:val="0"/>
           <w:i w:val="0"/>
         </w:rPr>
-        <w:t>* — все четыре модели против спама, но мета-модель подняла итог до 0.784 (порог 0.71); итог — спам.</w:t>
+        <w:t xml:space="preserve"> — все четыре модели против спама, но мета-модель подняла итог до 0.784 (порог 0.71); итог — спам.</w:t>
       </w:r>
     </w:p>
     <w:p>
       <w:pPr>
         <w:pStyle w:val="Heading2"/>
+        <w:spacing w:after="100" w:line="259" w:lineRule="auto"/>
       </w:pPr>
       <w:r>
         <w:rPr>
@@ -1893,25 +2337,27 @@
         <w:tblStyle w:val="TableGrid"/>
         <w:tblW w:type="auto" w:w="0"/>
         <w:jc w:val="center"/>
+        <w:tblLayout w:type="fixed"/>
         <w:tblLook w:firstColumn="1" w:firstRow="1" w:lastColumn="0" w:lastRow="0" w:noHBand="0" w:noVBand="1" w:val="04A0"/>
       </w:tblPr>
       <w:tblGrid>
-        <w:gridCol w:w="1282"/>
-        <w:gridCol w:w="1282"/>
-        <w:gridCol w:w="1282"/>
-        <w:gridCol w:w="1282"/>
-        <w:gridCol w:w="1282"/>
-        <w:gridCol w:w="1282"/>
-        <w:gridCol w:w="1282"/>
-        <w:gridCol w:w="1282"/>
+        <w:gridCol w:w="2376"/>
+        <w:gridCol w:w="792"/>
+        <w:gridCol w:w="1080"/>
+        <w:gridCol w:w="605"/>
+        <w:gridCol w:w="662"/>
+        <w:gridCol w:w="605"/>
+        <w:gridCol w:w="605"/>
+        <w:gridCol w:w="1080"/>
       </w:tblGrid>
       <w:tr>
         <w:trPr>
           <w:tblHeader w:val="true"/>
+          <w:cantSplit/>
         </w:trPr>
         <w:tc>
           <w:tcPr>
-            <w:tcW w:type="dxa" w:w="1282"/>
+            <w:tcW w:type="dxa" w:w="2376"/>
             <w:shd w:val="clear" w:color="auto" w:fill="EDF2F7"/>
           </w:tcPr>
           <w:p>
@@ -1921,12 +2367,14 @@
             <w:r>
               <w:rPr>
                 <w:b/>
+                <w:sz w:val="20"/>
               </w:rPr>
             </w:r>
             <w:r>
               <w:rPr>
                 <w:b/>
                 <w:i w:val="0"/>
+                <w:sz w:val="20"/>
               </w:rPr>
               <w:t>Тип данных</w:t>
             </w:r>
@@ -1934,7 +2382,7 @@
         </w:tc>
         <w:tc>
           <w:tcPr>
-            <w:tcW w:type="dxa" w:w="1282"/>
+            <w:tcW w:type="dxa" w:w="792"/>
             <w:shd w:val="clear" w:color="auto" w:fill="EDF2F7"/>
           </w:tcPr>
           <w:p>
@@ -1944,12 +2392,14 @@
             <w:r>
               <w:rPr>
                 <w:b/>
+                <w:sz w:val="20"/>
               </w:rPr>
             </w:r>
             <w:r>
               <w:rPr>
                 <w:b/>
                 <w:i w:val="0"/>
+                <w:sz w:val="20"/>
               </w:rPr>
               <w:t>Метка</w:t>
             </w:r>
@@ -1957,7 +2407,21 @@
         </w:tc>
         <w:tc>
           <w:tcPr>
-            <w:tcW w:type="dxa" w:w="1282"/>
+            <w:tcW w:type="dxa" w:w="1080"/>
+            <w:shd w:val="clear" w:color="auto" w:fill="EDF2F7"/>
+          </w:tcPr>
+          <w:p>
+            <w:r>
+              <w:rPr>
+                <w:b/>
+              </w:rPr>
+              <w:t>p(спам)</w:t>
+            </w:r>
+          </w:p>
+        </w:tc>
+        <w:tc>
+          <w:tcPr>
+            <w:tcW w:type="dxa" w:w="605"/>
             <w:shd w:val="clear" w:color="auto" w:fill="EDF2F7"/>
           </w:tcPr>
           <w:p>
@@ -1967,20 +2431,22 @@
             <w:r>
               <w:rPr>
                 <w:b/>
+                <w:sz w:val="20"/>
               </w:rPr>
             </w:r>
             <w:r>
               <w:rPr>
                 <w:b/>
                 <w:i w:val="0"/>
+                <w:sz w:val="20"/>
               </w:rPr>
-              <w:t>Вероятность</w:t>
+              <w:t>LR</w:t>
             </w:r>
           </w:p>
         </w:tc>
         <w:tc>
           <w:tcPr>
-            <w:tcW w:type="dxa" w:w="1282"/>
+            <w:tcW w:type="dxa" w:w="662"/>
             <w:shd w:val="clear" w:color="auto" w:fill="EDF2F7"/>
           </w:tcPr>
           <w:p>
@@ -1990,20 +2456,22 @@
             <w:r>
               <w:rPr>
                 <w:b/>
+                <w:sz w:val="20"/>
               </w:rPr>
             </w:r>
             <w:r>
               <w:rPr>
                 <w:b/>
                 <w:i w:val="0"/>
+                <w:sz w:val="20"/>
               </w:rPr>
-              <w:t>LR</w:t>
+              <w:t>SVM</w:t>
             </w:r>
           </w:p>
         </w:tc>
         <w:tc>
           <w:tcPr>
-            <w:tcW w:type="dxa" w:w="1282"/>
+            <w:tcW w:type="dxa" w:w="605"/>
             <w:shd w:val="clear" w:color="auto" w:fill="EDF2F7"/>
           </w:tcPr>
           <w:p>
@@ -2013,20 +2481,22 @@
             <w:r>
               <w:rPr>
                 <w:b/>
+                <w:sz w:val="20"/>
               </w:rPr>
             </w:r>
             <w:r>
               <w:rPr>
                 <w:b/>
                 <w:i w:val="0"/>
+                <w:sz w:val="20"/>
               </w:rPr>
-              <w:t>SVM</w:t>
+              <w:t>NB</w:t>
             </w:r>
           </w:p>
         </w:tc>
         <w:tc>
           <w:tcPr>
-            <w:tcW w:type="dxa" w:w="1282"/>
+            <w:tcW w:type="dxa" w:w="605"/>
             <w:shd w:val="clear" w:color="auto" w:fill="EDF2F7"/>
           </w:tcPr>
           <w:p>
@@ -2036,20 +2506,22 @@
             <w:r>
               <w:rPr>
                 <w:b/>
+                <w:sz w:val="20"/>
               </w:rPr>
             </w:r>
             <w:r>
               <w:rPr>
                 <w:b/>
                 <w:i w:val="0"/>
+                <w:sz w:val="20"/>
               </w:rPr>
-              <w:t>NB</w:t>
+              <w:t>GB</w:t>
             </w:r>
           </w:p>
         </w:tc>
         <w:tc>
           <w:tcPr>
-            <w:tcW w:type="dxa" w:w="1282"/>
+            <w:tcW w:type="dxa" w:w="1080"/>
             <w:shd w:val="clear" w:color="auto" w:fill="EDF2F7"/>
           </w:tcPr>
           <w:p>
@@ -2059,21 +2531,27 @@
             <w:r>
               <w:rPr>
                 <w:b/>
+                <w:sz w:val="20"/>
               </w:rPr>
             </w:r>
             <w:r>
               <w:rPr>
                 <w:b/>
                 <w:i w:val="0"/>
+                <w:sz w:val="20"/>
               </w:rPr>
-              <w:t>GB</w:t>
+              <w:t>Решение</w:t>
             </w:r>
           </w:p>
         </w:tc>
+      </w:tr>
+      <w:tr>
+        <w:trPr>
+          <w:cantSplit/>
+        </w:trPr>
         <w:tc>
           <w:tcPr>
-            <w:tcW w:type="dxa" w:w="1282"/>
-            <w:shd w:val="clear" w:color="auto" w:fill="EDF2F7"/>
+            <w:tcW w:type="dxa" w:w="2376"/>
           </w:tcPr>
           <w:p>
             <w:pPr>
@@ -2081,33 +2559,14 @@
             </w:pPr>
             <w:r>
               <w:rPr>
-                <w:b/>
+                <w:sz w:val="20"/>
               </w:rPr>
             </w:r>
             <w:r>
               <w:rPr>
-                <w:b/>
-                <w:i w:val="0"/>
-              </w:rPr>
-              <w:t>Решение</w:t>
-            </w:r>
-          </w:p>
-        </w:tc>
-      </w:tr>
-      <w:tr>
-        <w:tc>
-          <w:tcPr>
-            <w:tcW w:type="dxa" w:w="1282"/>
-          </w:tcPr>
-          <w:p>
-            <w:pPr>
-              <w:spacing w:after="40"/>
-            </w:pPr>
-            <w:r/>
-            <w:r>
-              <w:rPr>
                 <w:b w:val="0"/>
                 <w:i w:val="0"/>
+                <w:sz w:val="20"/>
               </w:rPr>
               <w:t>категория «реклама»</w:t>
             </w:r>
@@ -2115,17 +2574,22 @@
         </w:tc>
         <w:tc>
           <w:tcPr>
-            <w:tcW w:type="dxa" w:w="1282"/>
+            <w:tcW w:type="dxa" w:w="792"/>
           </w:tcPr>
           <w:p>
             <w:pPr>
               <w:spacing w:after="40"/>
             </w:pPr>
-            <w:r/>
+            <w:r>
+              <w:rPr>
+                <w:sz w:val="20"/>
+              </w:rPr>
+            </w:r>
             <w:r>
               <w:rPr>
                 <w:b w:val="0"/>
                 <w:i w:val="0"/>
+                <w:sz w:val="20"/>
               </w:rPr>
               <w:t>спам</w:t>
             </w:r>
@@ -2133,17 +2597,22 @@
         </w:tc>
         <w:tc>
           <w:tcPr>
-            <w:tcW w:type="dxa" w:w="1282"/>
+            <w:tcW w:type="dxa" w:w="1080"/>
           </w:tcPr>
           <w:p>
             <w:pPr>
               <w:spacing w:after="40"/>
             </w:pPr>
-            <w:r/>
+            <w:r>
+              <w:rPr>
+                <w:sz w:val="20"/>
+              </w:rPr>
+            </w:r>
             <w:r>
               <w:rPr>
                 <w:b/>
                 <w:i w:val="0"/>
+                <w:sz w:val="20"/>
               </w:rPr>
               <w:t>0.718</w:t>
             </w:r>
@@ -2151,17 +2620,22 @@
         </w:tc>
         <w:tc>
           <w:tcPr>
-            <w:tcW w:type="dxa" w:w="1282"/>
+            <w:tcW w:type="dxa" w:w="605"/>
           </w:tcPr>
           <w:p>
             <w:pPr>
               <w:spacing w:after="40"/>
             </w:pPr>
-            <w:r/>
+            <w:r>
+              <w:rPr>
+                <w:sz w:val="20"/>
+              </w:rPr>
+            </w:r>
             <w:r>
               <w:rPr>
                 <w:b w:val="0"/>
                 <w:i w:val="0"/>
+                <w:sz w:val="20"/>
               </w:rPr>
               <w:t>0.87</w:t>
             </w:r>
@@ -2169,17 +2643,22 @@
         </w:tc>
         <w:tc>
           <w:tcPr>
-            <w:tcW w:type="dxa" w:w="1282"/>
+            <w:tcW w:type="dxa" w:w="662"/>
           </w:tcPr>
           <w:p>
             <w:pPr>
               <w:spacing w:after="40"/>
             </w:pPr>
-            <w:r/>
+            <w:r>
+              <w:rPr>
+                <w:sz w:val="20"/>
+              </w:rPr>
+            </w:r>
             <w:r>
               <w:rPr>
                 <w:b w:val="0"/>
                 <w:i w:val="0"/>
+                <w:sz w:val="20"/>
               </w:rPr>
               <w:t>0.94</w:t>
             </w:r>
@@ -2187,17 +2666,22 @@
         </w:tc>
         <w:tc>
           <w:tcPr>
-            <w:tcW w:type="dxa" w:w="1282"/>
+            <w:tcW w:type="dxa" w:w="605"/>
           </w:tcPr>
           <w:p>
             <w:pPr>
               <w:spacing w:after="40"/>
             </w:pPr>
-            <w:r/>
+            <w:r>
+              <w:rPr>
+                <w:sz w:val="20"/>
+              </w:rPr>
+            </w:r>
             <w:r>
               <w:rPr>
                 <w:b w:val="0"/>
                 <w:i w:val="0"/>
+                <w:sz w:val="20"/>
               </w:rPr>
               <w:t>0.94</w:t>
             </w:r>
@@ -2205,17 +2689,22 @@
         </w:tc>
         <w:tc>
           <w:tcPr>
-            <w:tcW w:type="dxa" w:w="1282"/>
+            <w:tcW w:type="dxa" w:w="605"/>
           </w:tcPr>
           <w:p>
             <w:pPr>
               <w:spacing w:after="40"/>
             </w:pPr>
-            <w:r/>
+            <w:r>
+              <w:rPr>
+                <w:sz w:val="20"/>
+              </w:rPr>
+            </w:r>
             <w:r>
               <w:rPr>
                 <w:b w:val="0"/>
                 <w:i w:val="0"/>
+                <w:sz w:val="20"/>
               </w:rPr>
               <w:t>0.96</w:t>
             </w:r>
@@ -2223,17 +2712,22 @@
         </w:tc>
         <w:tc>
           <w:tcPr>
-            <w:tcW w:type="dxa" w:w="1282"/>
+            <w:tcW w:type="dxa" w:w="1080"/>
           </w:tcPr>
           <w:p>
             <w:pPr>
               <w:spacing w:after="40"/>
             </w:pPr>
-            <w:r/>
+            <w:r>
+              <w:rPr>
+                <w:sz w:val="20"/>
+              </w:rPr>
+            </w:r>
             <w:r>
               <w:rPr>
                 <w:b w:val="0"/>
                 <w:i w:val="0"/>
+                <w:sz w:val="20"/>
               </w:rPr>
               <w:t>спам ✓</w:t>
             </w:r>
@@ -2241,19 +2735,27 @@
         </w:tc>
       </w:tr>
       <w:tr>
+        <w:trPr>
+          <w:cantSplit/>
+        </w:trPr>
         <w:tc>
           <w:tcPr>
-            <w:tcW w:type="dxa" w:w="1282"/>
+            <w:tcW w:type="dxa" w:w="2376"/>
           </w:tcPr>
           <w:p>
             <w:pPr>
               <w:spacing w:after="40"/>
             </w:pPr>
-            <w:r/>
+            <w:r>
+              <w:rPr>
+                <w:sz w:val="20"/>
+              </w:rPr>
+            </w:r>
             <w:r>
               <w:rPr>
                 <w:b w:val="0"/>
                 <w:i w:val="0"/>
+                <w:sz w:val="20"/>
               </w:rPr>
               <w:t>категория «работа»</w:t>
             </w:r>
@@ -2261,17 +2763,22 @@
         </w:tc>
         <w:tc>
           <w:tcPr>
-            <w:tcW w:type="dxa" w:w="1282"/>
+            <w:tcW w:type="dxa" w:w="792"/>
           </w:tcPr>
           <w:p>
             <w:pPr>
               <w:spacing w:after="40"/>
             </w:pPr>
-            <w:r/>
+            <w:r>
+              <w:rPr>
+                <w:sz w:val="20"/>
+              </w:rPr>
+            </w:r>
             <w:r>
               <w:rPr>
                 <w:b w:val="0"/>
                 <w:i w:val="0"/>
+                <w:sz w:val="20"/>
               </w:rPr>
               <w:t>спам</w:t>
             </w:r>
@@ -2279,17 +2786,22 @@
         </w:tc>
         <w:tc>
           <w:tcPr>
-            <w:tcW w:type="dxa" w:w="1282"/>
+            <w:tcW w:type="dxa" w:w="1080"/>
           </w:tcPr>
           <w:p>
             <w:pPr>
               <w:spacing w:after="40"/>
             </w:pPr>
-            <w:r/>
+            <w:r>
+              <w:rPr>
+                <w:sz w:val="20"/>
+              </w:rPr>
+            </w:r>
             <w:r>
               <w:rPr>
                 <w:b/>
                 <w:i w:val="0"/>
+                <w:sz w:val="20"/>
               </w:rPr>
               <w:t>0.841</w:t>
             </w:r>
@@ -2297,17 +2809,22 @@
         </w:tc>
         <w:tc>
           <w:tcPr>
-            <w:tcW w:type="dxa" w:w="1282"/>
+            <w:tcW w:type="dxa" w:w="605"/>
           </w:tcPr>
           <w:p>
             <w:pPr>
               <w:spacing w:after="40"/>
             </w:pPr>
-            <w:r/>
+            <w:r>
+              <w:rPr>
+                <w:sz w:val="20"/>
+              </w:rPr>
+            </w:r>
             <w:r>
               <w:rPr>
                 <w:b w:val="0"/>
                 <w:i w:val="0"/>
+                <w:sz w:val="20"/>
               </w:rPr>
               <w:t>0.75</w:t>
             </w:r>
@@ -2315,17 +2832,22 @@
         </w:tc>
         <w:tc>
           <w:tcPr>
-            <w:tcW w:type="dxa" w:w="1282"/>
+            <w:tcW w:type="dxa" w:w="662"/>
           </w:tcPr>
           <w:p>
             <w:pPr>
               <w:spacing w:after="40"/>
             </w:pPr>
-            <w:r/>
+            <w:r>
+              <w:rPr>
+                <w:sz w:val="20"/>
+              </w:rPr>
+            </w:r>
             <w:r>
               <w:rPr>
                 <w:b w:val="0"/>
                 <w:i w:val="0"/>
+                <w:sz w:val="20"/>
               </w:rPr>
               <w:t>0.80</w:t>
             </w:r>
@@ -2333,17 +2855,22 @@
         </w:tc>
         <w:tc>
           <w:tcPr>
-            <w:tcW w:type="dxa" w:w="1282"/>
+            <w:tcW w:type="dxa" w:w="605"/>
           </w:tcPr>
           <w:p>
             <w:pPr>
               <w:spacing w:after="40"/>
             </w:pPr>
-            <w:r/>
+            <w:r>
+              <w:rPr>
+                <w:sz w:val="20"/>
+              </w:rPr>
+            </w:r>
             <w:r>
               <w:rPr>
                 <w:b w:val="0"/>
                 <w:i w:val="0"/>
+                <w:sz w:val="20"/>
               </w:rPr>
               <w:t>0.42</w:t>
             </w:r>
@@ -2351,17 +2878,22 @@
         </w:tc>
         <w:tc>
           <w:tcPr>
-            <w:tcW w:type="dxa" w:w="1282"/>
+            <w:tcW w:type="dxa" w:w="605"/>
           </w:tcPr>
           <w:p>
             <w:pPr>
               <w:spacing w:after="40"/>
             </w:pPr>
-            <w:r/>
+            <w:r>
+              <w:rPr>
+                <w:sz w:val="20"/>
+              </w:rPr>
+            </w:r>
             <w:r>
               <w:rPr>
                 <w:b w:val="0"/>
                 <w:i w:val="0"/>
+                <w:sz w:val="20"/>
               </w:rPr>
               <w:t>0.97</w:t>
             </w:r>
@@ -2369,17 +2901,22 @@
         </w:tc>
         <w:tc>
           <w:tcPr>
-            <w:tcW w:type="dxa" w:w="1282"/>
+            <w:tcW w:type="dxa" w:w="1080"/>
           </w:tcPr>
           <w:p>
             <w:pPr>
               <w:spacing w:after="40"/>
             </w:pPr>
-            <w:r/>
+            <w:r>
+              <w:rPr>
+                <w:sz w:val="20"/>
+              </w:rPr>
+            </w:r>
             <w:r>
               <w:rPr>
                 <w:b w:val="0"/>
                 <w:i w:val="0"/>
+                <w:sz w:val="20"/>
               </w:rPr>
               <w:t>спам ✓</w:t>
             </w:r>
@@ -2387,19 +2924,27 @@
         </w:tc>
       </w:tr>
       <w:tr>
+        <w:trPr>
+          <w:cantSplit/>
+        </w:trPr>
         <w:tc>
           <w:tcPr>
-            <w:tcW w:type="dxa" w:w="1282"/>
+            <w:tcW w:type="dxa" w:w="2376"/>
           </w:tcPr>
           <w:p>
             <w:pPr>
               <w:spacing w:after="40"/>
             </w:pPr>
-            <w:r/>
+            <w:r>
+              <w:rPr>
+                <w:sz w:val="20"/>
+              </w:rPr>
+            </w:r>
             <w:r>
               <w:rPr>
                 <w:b w:val="0"/>
                 <w:i w:val="0"/>
+                <w:sz w:val="20"/>
               </w:rPr>
               <w:t>категория «знакомства»</w:t>
             </w:r>
@@ -2407,17 +2952,22 @@
         </w:tc>
         <w:tc>
           <w:tcPr>
-            <w:tcW w:type="dxa" w:w="1282"/>
+            <w:tcW w:type="dxa" w:w="792"/>
           </w:tcPr>
           <w:p>
             <w:pPr>
               <w:spacing w:after="40"/>
             </w:pPr>
-            <w:r/>
+            <w:r>
+              <w:rPr>
+                <w:sz w:val="20"/>
+              </w:rPr>
+            </w:r>
             <w:r>
               <w:rPr>
                 <w:b w:val="0"/>
                 <w:i w:val="0"/>
+                <w:sz w:val="20"/>
               </w:rPr>
               <w:t>спам</w:t>
             </w:r>
@@ -2425,17 +2975,22 @@
         </w:tc>
         <w:tc>
           <w:tcPr>
-            <w:tcW w:type="dxa" w:w="1282"/>
+            <w:tcW w:type="dxa" w:w="1080"/>
           </w:tcPr>
           <w:p>
             <w:pPr>
               <w:spacing w:after="40"/>
             </w:pPr>
-            <w:r/>
+            <w:r>
+              <w:rPr>
+                <w:sz w:val="20"/>
+              </w:rPr>
+            </w:r>
             <w:r>
               <w:rPr>
                 <w:b/>
                 <w:i w:val="0"/>
+                <w:sz w:val="20"/>
               </w:rPr>
               <w:t>0.840</w:t>
             </w:r>
@@ -2443,17 +2998,22 @@
         </w:tc>
         <w:tc>
           <w:tcPr>
-            <w:tcW w:type="dxa" w:w="1282"/>
+            <w:tcW w:type="dxa" w:w="605"/>
           </w:tcPr>
           <w:p>
             <w:pPr>
               <w:spacing w:after="40"/>
             </w:pPr>
-            <w:r/>
+            <w:r>
+              <w:rPr>
+                <w:sz w:val="20"/>
+              </w:rPr>
+            </w:r>
             <w:r>
               <w:rPr>
                 <w:b w:val="0"/>
                 <w:i w:val="0"/>
+                <w:sz w:val="20"/>
               </w:rPr>
               <w:t>0.14</w:t>
             </w:r>
@@ -2461,17 +3021,22 @@
         </w:tc>
         <w:tc>
           <w:tcPr>
-            <w:tcW w:type="dxa" w:w="1282"/>
+            <w:tcW w:type="dxa" w:w="662"/>
           </w:tcPr>
           <w:p>
             <w:pPr>
               <w:spacing w:after="40"/>
             </w:pPr>
-            <w:r/>
+            <w:r>
+              <w:rPr>
+                <w:sz w:val="20"/>
+              </w:rPr>
+            </w:r>
             <w:r>
               <w:rPr>
                 <w:b w:val="0"/>
                 <w:i w:val="0"/>
+                <w:sz w:val="20"/>
               </w:rPr>
               <w:t>0.04</w:t>
             </w:r>
@@ -2479,17 +3044,22 @@
         </w:tc>
         <w:tc>
           <w:tcPr>
-            <w:tcW w:type="dxa" w:w="1282"/>
+            <w:tcW w:type="dxa" w:w="605"/>
           </w:tcPr>
           <w:p>
             <w:pPr>
               <w:spacing w:after="40"/>
             </w:pPr>
-            <w:r/>
+            <w:r>
+              <w:rPr>
+                <w:sz w:val="20"/>
+              </w:rPr>
+            </w:r>
             <w:r>
               <w:rPr>
                 <w:b w:val="0"/>
                 <w:i w:val="0"/>
+                <w:sz w:val="20"/>
               </w:rPr>
               <w:t>0.00</w:t>
             </w:r>
@@ -2497,17 +3067,22 @@
         </w:tc>
         <w:tc>
           <w:tcPr>
-            <w:tcW w:type="dxa" w:w="1282"/>
+            <w:tcW w:type="dxa" w:w="605"/>
           </w:tcPr>
           <w:p>
             <w:pPr>
               <w:spacing w:after="40"/>
             </w:pPr>
-            <w:r/>
+            <w:r>
+              <w:rPr>
+                <w:sz w:val="20"/>
+              </w:rPr>
+            </w:r>
             <w:r>
               <w:rPr>
                 <w:b w:val="0"/>
                 <w:i w:val="0"/>
+                <w:sz w:val="20"/>
               </w:rPr>
               <w:t>0.03</w:t>
             </w:r>
@@ -2515,17 +3090,22 @@
         </w:tc>
         <w:tc>
           <w:tcPr>
-            <w:tcW w:type="dxa" w:w="1282"/>
+            <w:tcW w:type="dxa" w:w="1080"/>
           </w:tcPr>
           <w:p>
             <w:pPr>
               <w:spacing w:after="40"/>
             </w:pPr>
-            <w:r/>
+            <w:r>
+              <w:rPr>
+                <w:sz w:val="20"/>
+              </w:rPr>
+            </w:r>
             <w:r>
               <w:rPr>
                 <w:b w:val="0"/>
                 <w:i w:val="0"/>
+                <w:sz w:val="20"/>
               </w:rPr>
               <w:t>спам ✓</w:t>
             </w:r>
@@ -2533,19 +3113,27 @@
         </w:tc>
       </w:tr>
       <w:tr>
+        <w:trPr>
+          <w:cantSplit/>
+        </w:trPr>
         <w:tc>
           <w:tcPr>
-            <w:tcW w:type="dxa" w:w="1282"/>
+            <w:tcW w:type="dxa" w:w="2376"/>
           </w:tcPr>
           <w:p>
             <w:pPr>
               <w:spacing w:after="40"/>
             </w:pPr>
-            <w:r/>
+            <w:r>
+              <w:rPr>
+                <w:sz w:val="20"/>
+              </w:rPr>
+            </w:r>
             <w:r>
               <w:rPr>
                 <w:b w:val="0"/>
                 <w:i w:val="0"/>
+                <w:sz w:val="20"/>
               </w:rPr>
               <w:t>категория «финансы»</w:t>
             </w:r>
@@ -2553,17 +3141,22 @@
         </w:tc>
         <w:tc>
           <w:tcPr>
-            <w:tcW w:type="dxa" w:w="1282"/>
+            <w:tcW w:type="dxa" w:w="792"/>
           </w:tcPr>
           <w:p>
             <w:pPr>
               <w:spacing w:after="40"/>
             </w:pPr>
-            <w:r/>
+            <w:r>
+              <w:rPr>
+                <w:sz w:val="20"/>
+              </w:rPr>
+            </w:r>
             <w:r>
               <w:rPr>
                 <w:b w:val="0"/>
                 <w:i w:val="0"/>
+                <w:sz w:val="20"/>
               </w:rPr>
               <w:t>спам</w:t>
             </w:r>
@@ -2571,17 +3164,22 @@
         </w:tc>
         <w:tc>
           <w:tcPr>
-            <w:tcW w:type="dxa" w:w="1282"/>
+            <w:tcW w:type="dxa" w:w="1080"/>
           </w:tcPr>
           <w:p>
             <w:pPr>
               <w:spacing w:after="40"/>
             </w:pPr>
-            <w:r/>
+            <w:r>
+              <w:rPr>
+                <w:sz w:val="20"/>
+              </w:rPr>
+            </w:r>
             <w:r>
               <w:rPr>
                 <w:b/>
                 <w:i w:val="0"/>
+                <w:sz w:val="20"/>
               </w:rPr>
               <w:t>0.754</w:t>
             </w:r>
@@ -2589,17 +3187,22 @@
         </w:tc>
         <w:tc>
           <w:tcPr>
-            <w:tcW w:type="dxa" w:w="1282"/>
+            <w:tcW w:type="dxa" w:w="605"/>
           </w:tcPr>
           <w:p>
             <w:pPr>
               <w:spacing w:after="40"/>
             </w:pPr>
-            <w:r/>
+            <w:r>
+              <w:rPr>
+                <w:sz w:val="20"/>
+              </w:rPr>
+            </w:r>
             <w:r>
               <w:rPr>
                 <w:b w:val="0"/>
                 <w:i w:val="0"/>
+                <w:sz w:val="20"/>
               </w:rPr>
               <w:t>0.57</w:t>
             </w:r>
@@ -2607,17 +3210,22 @@
         </w:tc>
         <w:tc>
           <w:tcPr>
-            <w:tcW w:type="dxa" w:w="1282"/>
+            <w:tcW w:type="dxa" w:w="662"/>
           </w:tcPr>
           <w:p>
             <w:pPr>
               <w:spacing w:after="40"/>
             </w:pPr>
-            <w:r/>
+            <w:r>
+              <w:rPr>
+                <w:sz w:val="20"/>
+              </w:rPr>
+            </w:r>
             <w:r>
               <w:rPr>
                 <w:b w:val="0"/>
                 <w:i w:val="0"/>
+                <w:sz w:val="20"/>
               </w:rPr>
               <w:t>0.47</w:t>
             </w:r>
@@ -2625,17 +3233,22 @@
         </w:tc>
         <w:tc>
           <w:tcPr>
-            <w:tcW w:type="dxa" w:w="1282"/>
+            <w:tcW w:type="dxa" w:w="605"/>
           </w:tcPr>
           <w:p>
             <w:pPr>
               <w:spacing w:after="40"/>
             </w:pPr>
-            <w:r/>
+            <w:r>
+              <w:rPr>
+                <w:sz w:val="20"/>
+              </w:rPr>
+            </w:r>
             <w:r>
               <w:rPr>
                 <w:b w:val="0"/>
                 <w:i w:val="0"/>
+                <w:sz w:val="20"/>
               </w:rPr>
               <w:t>0.82</w:t>
             </w:r>
@@ -2643,17 +3256,22 @@
         </w:tc>
         <w:tc>
           <w:tcPr>
-            <w:tcW w:type="dxa" w:w="1282"/>
+            <w:tcW w:type="dxa" w:w="605"/>
           </w:tcPr>
           <w:p>
             <w:pPr>
               <w:spacing w:after="40"/>
             </w:pPr>
-            <w:r/>
+            <w:r>
+              <w:rPr>
+                <w:sz w:val="20"/>
+              </w:rPr>
+            </w:r>
             <w:r>
               <w:rPr>
                 <w:b w:val="0"/>
                 <w:i w:val="0"/>
+                <w:sz w:val="20"/>
               </w:rPr>
               <w:t>0.97</w:t>
             </w:r>
@@ -2661,17 +3279,22 @@
         </w:tc>
         <w:tc>
           <w:tcPr>
-            <w:tcW w:type="dxa" w:w="1282"/>
+            <w:tcW w:type="dxa" w:w="1080"/>
           </w:tcPr>
           <w:p>
             <w:pPr>
               <w:spacing w:after="40"/>
             </w:pPr>
-            <w:r/>
+            <w:r>
+              <w:rPr>
+                <w:sz w:val="20"/>
+              </w:rPr>
+            </w:r>
             <w:r>
               <w:rPr>
                 <w:b w:val="0"/>
                 <w:i w:val="0"/>
+                <w:sz w:val="20"/>
               </w:rPr>
               <w:t>спам ✓</w:t>
             </w:r>
@@ -2679,19 +3302,27 @@
         </w:tc>
       </w:tr>
       <w:tr>
+        <w:trPr>
+          <w:cantSplit/>
+        </w:trPr>
         <w:tc>
           <w:tcPr>
-            <w:tcW w:type="dxa" w:w="1282"/>
+            <w:tcW w:type="dxa" w:w="2376"/>
           </w:tcPr>
           <w:p>
             <w:pPr>
               <w:spacing w:after="40"/>
             </w:pPr>
-            <w:r/>
+            <w:r>
+              <w:rPr>
+                <w:sz w:val="20"/>
+              </w:rPr>
+            </w:r>
             <w:r>
               <w:rPr>
                 <w:b w:val="0"/>
                 <w:i w:val="0"/>
+                <w:sz w:val="20"/>
               </w:rPr>
               <w:t>категория «доставка»</w:t>
             </w:r>
@@ -2699,17 +3330,22 @@
         </w:tc>
         <w:tc>
           <w:tcPr>
-            <w:tcW w:type="dxa" w:w="1282"/>
+            <w:tcW w:type="dxa" w:w="792"/>
           </w:tcPr>
           <w:p>
             <w:pPr>
               <w:spacing w:after="40"/>
             </w:pPr>
-            <w:r/>
+            <w:r>
+              <w:rPr>
+                <w:sz w:val="20"/>
+              </w:rPr>
+            </w:r>
             <w:r>
               <w:rPr>
                 <w:b w:val="0"/>
                 <w:i w:val="0"/>
+                <w:sz w:val="20"/>
               </w:rPr>
               <w:t>спам</w:t>
             </w:r>
@@ -2717,17 +3353,22 @@
         </w:tc>
         <w:tc>
           <w:tcPr>
-            <w:tcW w:type="dxa" w:w="1282"/>
+            <w:tcW w:type="dxa" w:w="1080"/>
           </w:tcPr>
           <w:p>
             <w:pPr>
               <w:spacing w:after="40"/>
             </w:pPr>
-            <w:r/>
+            <w:r>
+              <w:rPr>
+                <w:sz w:val="20"/>
+              </w:rPr>
+            </w:r>
             <w:r>
               <w:rPr>
                 <w:b/>
                 <w:i w:val="0"/>
+                <w:sz w:val="20"/>
               </w:rPr>
               <w:t>0.867</w:t>
             </w:r>
@@ -2735,17 +3376,22 @@
         </w:tc>
         <w:tc>
           <w:tcPr>
-            <w:tcW w:type="dxa" w:w="1282"/>
+            <w:tcW w:type="dxa" w:w="605"/>
           </w:tcPr>
           <w:p>
             <w:pPr>
               <w:spacing w:after="40"/>
             </w:pPr>
-            <w:r/>
+            <w:r>
+              <w:rPr>
+                <w:sz w:val="20"/>
+              </w:rPr>
+            </w:r>
             <w:r>
               <w:rPr>
                 <w:b w:val="0"/>
                 <w:i w:val="0"/>
+                <w:sz w:val="20"/>
               </w:rPr>
               <w:t>0.63</w:t>
             </w:r>
@@ -2753,17 +3399,22 @@
         </w:tc>
         <w:tc>
           <w:tcPr>
-            <w:tcW w:type="dxa" w:w="1282"/>
+            <w:tcW w:type="dxa" w:w="662"/>
           </w:tcPr>
           <w:p>
             <w:pPr>
               <w:spacing w:after="40"/>
             </w:pPr>
-            <w:r/>
+            <w:r>
+              <w:rPr>
+                <w:sz w:val="20"/>
+              </w:rPr>
+            </w:r>
             <w:r>
               <w:rPr>
                 <w:b w:val="0"/>
                 <w:i w:val="0"/>
+                <w:sz w:val="20"/>
               </w:rPr>
               <w:t>0.59</w:t>
             </w:r>
@@ -2771,17 +3422,22 @@
         </w:tc>
         <w:tc>
           <w:tcPr>
-            <w:tcW w:type="dxa" w:w="1282"/>
+            <w:tcW w:type="dxa" w:w="605"/>
           </w:tcPr>
           <w:p>
             <w:pPr>
               <w:spacing w:after="40"/>
             </w:pPr>
-            <w:r/>
+            <w:r>
+              <w:rPr>
+                <w:sz w:val="20"/>
+              </w:rPr>
+            </w:r>
             <w:r>
               <w:rPr>
                 <w:b w:val="0"/>
                 <w:i w:val="0"/>
+                <w:sz w:val="20"/>
               </w:rPr>
               <w:t>0.97</w:t>
             </w:r>
@@ -2789,17 +3445,22 @@
         </w:tc>
         <w:tc>
           <w:tcPr>
-            <w:tcW w:type="dxa" w:w="1282"/>
+            <w:tcW w:type="dxa" w:w="605"/>
           </w:tcPr>
           <w:p>
             <w:pPr>
               <w:spacing w:after="40"/>
             </w:pPr>
-            <w:r/>
+            <w:r>
+              <w:rPr>
+                <w:sz w:val="20"/>
+              </w:rPr>
+            </w:r>
             <w:r>
               <w:rPr>
                 <w:b w:val="0"/>
                 <w:i w:val="0"/>
+                <w:sz w:val="20"/>
               </w:rPr>
               <w:t>0.95</w:t>
             </w:r>
@@ -2807,17 +3468,22 @@
         </w:tc>
         <w:tc>
           <w:tcPr>
-            <w:tcW w:type="dxa" w:w="1282"/>
+            <w:tcW w:type="dxa" w:w="1080"/>
           </w:tcPr>
           <w:p>
             <w:pPr>
               <w:spacing w:after="40"/>
             </w:pPr>
-            <w:r/>
+            <w:r>
+              <w:rPr>
+                <w:sz w:val="20"/>
+              </w:rPr>
+            </w:r>
             <w:r>
               <w:rPr>
                 <w:b w:val="0"/>
                 <w:i w:val="0"/>
+                <w:sz w:val="20"/>
               </w:rPr>
               <w:t>спам ✓</w:t>
             </w:r>
@@ -2825,19 +3491,27 @@
         </w:tc>
       </w:tr>
       <w:tr>
+        <w:trPr>
+          <w:cantSplit/>
+        </w:trPr>
         <w:tc>
           <w:tcPr>
-            <w:tcW w:type="dxa" w:w="1282"/>
+            <w:tcW w:type="dxa" w:w="2376"/>
           </w:tcPr>
           <w:p>
             <w:pPr>
               <w:spacing w:after="40"/>
             </w:pPr>
-            <w:r/>
+            <w:r>
+              <w:rPr>
+                <w:sz w:val="20"/>
+              </w:rPr>
+            </w:r>
             <w:r>
               <w:rPr>
                 <w:b w:val="0"/>
                 <w:i w:val="0"/>
+                <w:sz w:val="20"/>
               </w:rPr>
               <w:t>категория «безопасность»</w:t>
             </w:r>
@@ -2845,17 +3519,22 @@
         </w:tc>
         <w:tc>
           <w:tcPr>
-            <w:tcW w:type="dxa" w:w="1282"/>
+            <w:tcW w:type="dxa" w:w="792"/>
           </w:tcPr>
           <w:p>
             <w:pPr>
               <w:spacing w:after="40"/>
             </w:pPr>
-            <w:r/>
+            <w:r>
+              <w:rPr>
+                <w:sz w:val="20"/>
+              </w:rPr>
+            </w:r>
             <w:r>
               <w:rPr>
                 <w:b w:val="0"/>
                 <w:i w:val="0"/>
+                <w:sz w:val="20"/>
               </w:rPr>
               <w:t>спам</w:t>
             </w:r>
@@ -2863,17 +3542,22 @@
         </w:tc>
         <w:tc>
           <w:tcPr>
-            <w:tcW w:type="dxa" w:w="1282"/>
+            <w:tcW w:type="dxa" w:w="1080"/>
           </w:tcPr>
           <w:p>
             <w:pPr>
               <w:spacing w:after="40"/>
             </w:pPr>
-            <w:r/>
+            <w:r>
+              <w:rPr>
+                <w:sz w:val="20"/>
+              </w:rPr>
+            </w:r>
             <w:r>
               <w:rPr>
                 <w:b/>
                 <w:i w:val="0"/>
+                <w:sz w:val="20"/>
               </w:rPr>
               <w:t>0.699</w:t>
             </w:r>
@@ -2881,17 +3565,22 @@
         </w:tc>
         <w:tc>
           <w:tcPr>
-            <w:tcW w:type="dxa" w:w="1282"/>
+            <w:tcW w:type="dxa" w:w="605"/>
           </w:tcPr>
           <w:p>
             <w:pPr>
               <w:spacing w:after="40"/>
             </w:pPr>
-            <w:r/>
+            <w:r>
+              <w:rPr>
+                <w:sz w:val="20"/>
+              </w:rPr>
+            </w:r>
             <w:r>
               <w:rPr>
                 <w:b w:val="0"/>
                 <w:i w:val="0"/>
+                <w:sz w:val="20"/>
               </w:rPr>
               <w:t>0.77</w:t>
             </w:r>
@@ -2899,17 +3588,22 @@
         </w:tc>
         <w:tc>
           <w:tcPr>
-            <w:tcW w:type="dxa" w:w="1282"/>
+            <w:tcW w:type="dxa" w:w="662"/>
           </w:tcPr>
           <w:p>
             <w:pPr>
               <w:spacing w:after="40"/>
             </w:pPr>
-            <w:r/>
+            <w:r>
+              <w:rPr>
+                <w:sz w:val="20"/>
+              </w:rPr>
+            </w:r>
             <w:r>
               <w:rPr>
                 <w:b w:val="0"/>
                 <w:i w:val="0"/>
+                <w:sz w:val="20"/>
               </w:rPr>
               <w:t>0.79</w:t>
             </w:r>
@@ -2917,17 +3611,22 @@
         </w:tc>
         <w:tc>
           <w:tcPr>
-            <w:tcW w:type="dxa" w:w="1282"/>
+            <w:tcW w:type="dxa" w:w="605"/>
           </w:tcPr>
           <w:p>
             <w:pPr>
               <w:spacing w:after="40"/>
             </w:pPr>
-            <w:r/>
+            <w:r>
+              <w:rPr>
+                <w:sz w:val="20"/>
+              </w:rPr>
+            </w:r>
             <w:r>
               <w:rPr>
                 <w:b w:val="0"/>
                 <w:i w:val="0"/>
+                <w:sz w:val="20"/>
               </w:rPr>
               <w:t>0.97</w:t>
             </w:r>
@@ -2935,17 +3634,22 @@
         </w:tc>
         <w:tc>
           <w:tcPr>
-            <w:tcW w:type="dxa" w:w="1282"/>
+            <w:tcW w:type="dxa" w:w="605"/>
           </w:tcPr>
           <w:p>
             <w:pPr>
               <w:spacing w:after="40"/>
             </w:pPr>
-            <w:r/>
+            <w:r>
+              <w:rPr>
+                <w:sz w:val="20"/>
+              </w:rPr>
+            </w:r>
             <w:r>
               <w:rPr>
                 <w:b w:val="0"/>
                 <w:i w:val="0"/>
+                <w:sz w:val="20"/>
               </w:rPr>
               <w:t>0.98</w:t>
             </w:r>
@@ -2953,17 +3657,22 @@
         </w:tc>
         <w:tc>
           <w:tcPr>
-            <w:tcW w:type="dxa" w:w="1282"/>
+            <w:tcW w:type="dxa" w:w="1080"/>
           </w:tcPr>
           <w:p>
             <w:pPr>
               <w:spacing w:after="40"/>
             </w:pPr>
-            <w:r/>
+            <w:r>
+              <w:rPr>
+                <w:sz w:val="20"/>
+              </w:rPr>
+            </w:r>
             <w:r>
               <w:rPr>
                 <w:b w:val="0"/>
                 <w:i w:val="0"/>
+                <w:sz w:val="20"/>
               </w:rPr>
               <w:t>норма ✗</w:t>
             </w:r>
@@ -2971,19 +3680,27 @@
         </w:tc>
       </w:tr>
       <w:tr>
+        <w:trPr>
+          <w:cantSplit/>
+        </w:trPr>
         <w:tc>
           <w:tcPr>
-            <w:tcW w:type="dxa" w:w="1282"/>
+            <w:tcW w:type="dxa" w:w="2376"/>
           </w:tcPr>
           <w:p>
             <w:pPr>
               <w:spacing w:after="40"/>
             </w:pPr>
-            <w:r/>
+            <w:r>
+              <w:rPr>
+                <w:sz w:val="20"/>
+              </w:rPr>
+            </w:r>
             <w:r>
               <w:rPr>
                 <w:b w:val="0"/>
                 <w:i w:val="0"/>
+                <w:sz w:val="20"/>
               </w:rPr>
               <w:t>категория «прочее»</w:t>
             </w:r>
@@ -2991,17 +3708,22 @@
         </w:tc>
         <w:tc>
           <w:tcPr>
-            <w:tcW w:type="dxa" w:w="1282"/>
+            <w:tcW w:type="dxa" w:w="792"/>
           </w:tcPr>
           <w:p>
             <w:pPr>
               <w:spacing w:after="40"/>
             </w:pPr>
-            <w:r/>
+            <w:r>
+              <w:rPr>
+                <w:sz w:val="20"/>
+              </w:rPr>
+            </w:r>
             <w:r>
               <w:rPr>
                 <w:b w:val="0"/>
                 <w:i w:val="0"/>
+                <w:sz w:val="20"/>
               </w:rPr>
               <w:t>спам</w:t>
             </w:r>
@@ -3009,17 +3731,22 @@
         </w:tc>
         <w:tc>
           <w:tcPr>
-            <w:tcW w:type="dxa" w:w="1282"/>
+            <w:tcW w:type="dxa" w:w="1080"/>
           </w:tcPr>
           <w:p>
             <w:pPr>
               <w:spacing w:after="40"/>
             </w:pPr>
-            <w:r/>
+            <w:r>
+              <w:rPr>
+                <w:sz w:val="20"/>
+              </w:rPr>
+            </w:r>
             <w:r>
               <w:rPr>
                 <w:b/>
                 <w:i w:val="0"/>
+                <w:sz w:val="20"/>
               </w:rPr>
               <w:t>0.696</w:t>
             </w:r>
@@ -3027,17 +3754,22 @@
         </w:tc>
         <w:tc>
           <w:tcPr>
-            <w:tcW w:type="dxa" w:w="1282"/>
+            <w:tcW w:type="dxa" w:w="605"/>
           </w:tcPr>
           <w:p>
             <w:pPr>
               <w:spacing w:after="40"/>
             </w:pPr>
-            <w:r/>
+            <w:r>
+              <w:rPr>
+                <w:sz w:val="20"/>
+              </w:rPr>
+            </w:r>
             <w:r>
               <w:rPr>
                 <w:b w:val="0"/>
                 <w:i w:val="0"/>
+                <w:sz w:val="20"/>
               </w:rPr>
               <w:t>0.32</w:t>
             </w:r>
@@ -3045,17 +3777,22 @@
         </w:tc>
         <w:tc>
           <w:tcPr>
-            <w:tcW w:type="dxa" w:w="1282"/>
+            <w:tcW w:type="dxa" w:w="662"/>
           </w:tcPr>
           <w:p>
             <w:pPr>
               <w:spacing w:after="40"/>
             </w:pPr>
-            <w:r/>
+            <w:r>
+              <w:rPr>
+                <w:sz w:val="20"/>
+              </w:rPr>
+            </w:r>
             <w:r>
               <w:rPr>
                 <w:b w:val="0"/>
                 <w:i w:val="0"/>
+                <w:sz w:val="20"/>
               </w:rPr>
               <w:t>0.21</w:t>
             </w:r>
@@ -3063,17 +3800,22 @@
         </w:tc>
         <w:tc>
           <w:tcPr>
-            <w:tcW w:type="dxa" w:w="1282"/>
+            <w:tcW w:type="dxa" w:w="605"/>
           </w:tcPr>
           <w:p>
             <w:pPr>
               <w:spacing w:after="40"/>
             </w:pPr>
-            <w:r/>
+            <w:r>
+              <w:rPr>
+                <w:sz w:val="20"/>
+              </w:rPr>
+            </w:r>
             <w:r>
               <w:rPr>
                 <w:b w:val="0"/>
                 <w:i w:val="0"/>
+                <w:sz w:val="20"/>
               </w:rPr>
               <w:t>0.03</w:t>
             </w:r>
@@ -3081,17 +3823,22 @@
         </w:tc>
         <w:tc>
           <w:tcPr>
-            <w:tcW w:type="dxa" w:w="1282"/>
+            <w:tcW w:type="dxa" w:w="605"/>
           </w:tcPr>
           <w:p>
             <w:pPr>
               <w:spacing w:after="40"/>
             </w:pPr>
-            <w:r/>
+            <w:r>
+              <w:rPr>
+                <w:sz w:val="20"/>
+              </w:rPr>
+            </w:r>
             <w:r>
               <w:rPr>
                 <w:b w:val="0"/>
                 <w:i w:val="0"/>
+                <w:sz w:val="20"/>
               </w:rPr>
               <w:t>0.82</w:t>
             </w:r>
@@ -3099,17 +3846,22 @@
         </w:tc>
         <w:tc>
           <w:tcPr>
-            <w:tcW w:type="dxa" w:w="1282"/>
+            <w:tcW w:type="dxa" w:w="1080"/>
           </w:tcPr>
           <w:p>
             <w:pPr>
               <w:spacing w:after="40"/>
             </w:pPr>
-            <w:r/>
+            <w:r>
+              <w:rPr>
+                <w:sz w:val="20"/>
+              </w:rPr>
+            </w:r>
             <w:r>
               <w:rPr>
                 <w:b w:val="0"/>
                 <w:i w:val="0"/>
+                <w:sz w:val="20"/>
               </w:rPr>
               <w:t>норма ✗</w:t>
             </w:r>
@@ -3117,8 +3869,15 @@
         </w:tc>
       </w:tr>
     </w:tbl>
-    <w:p/>
     <w:p>
+      <w:pPr>
+        <w:spacing w:after="100" w:line="259" w:lineRule="auto"/>
+      </w:pPr>
+    </w:p>
+    <w:p>
+      <w:pPr>
+        <w:spacing w:after="100" w:line="259" w:lineRule="auto"/>
+      </w:pPr>
       <w:r>
         <w:rPr>
           <w:b w:val="0"/>
@@ -3128,6 +3887,9 @@
       </w:r>
     </w:p>
     <w:p>
+      <w:pPr>
+        <w:spacing w:after="100" w:line="259" w:lineRule="auto"/>
+      </w:pPr>
       <w:r>
         <w:rPr>
           <w:b w:val="0"/>
@@ -3151,6 +3913,9 @@
       </w:r>
     </w:p>
     <w:p>
+      <w:pPr>
+        <w:spacing w:after="100" w:line="259" w:lineRule="auto"/>
+      </w:pPr>
       <w:r>
         <w:rPr>
           <w:b w:val="0"/>
@@ -3170,10 +3935,13 @@
           <w:b w:val="0"/>
           <w:i w:val="0"/>
         </w:rPr>
-        <w:t>* — все четыре модели за спам — случай лёгкий.</w:t>
+        <w:t xml:space="preserve"> — все четыре модели за спам — случай лёгкий.</w:t>
       </w:r>
     </w:p>
     <w:p>
+      <w:pPr>
+        <w:spacing w:after="100" w:line="259" w:lineRule="auto"/>
+      </w:pPr>
       <w:r>
         <w:rPr>
           <w:b w:val="0"/>
@@ -3193,10 +3961,13 @@
           <w:b w:val="0"/>
           <w:i w:val="0"/>
         </w:rPr>
-        <w:t>* — против спама только NB (разброс 0.55), остальные за спам; итог — спам.</w:t>
+        <w:t xml:space="preserve"> — против спама только NB (разброс 0.55), остальные за спам; итог — спам.</w:t>
       </w:r>
     </w:p>
     <w:p>
+      <w:pPr>
+        <w:spacing w:after="100" w:line="259" w:lineRule="auto"/>
+      </w:pPr>
       <w:r>
         <w:rPr>
           <w:b w:val="0"/>
@@ -3216,10 +3987,13 @@
           <w:b w:val="0"/>
           <w:i w:val="0"/>
         </w:rPr>
-        <w:t>* — все четыре модели против спама, но мета-модель подняла итог до 0.840 (порог 0.71); итог — спам.</w:t>
+        <w:t xml:space="preserve"> — все четыре модели против спама, но мета-модель подняла итог до 0.840 (порог 0.71); итог — спам.</w:t>
       </w:r>
     </w:p>
     <w:p>
+      <w:pPr>
+        <w:spacing w:after="100" w:line="259" w:lineRule="auto"/>
+      </w:pPr>
       <w:r>
         <w:rPr>
           <w:b w:val="0"/>
@@ -3239,10 +4013,13 @@
           <w:b w:val="0"/>
           <w:i w:val="0"/>
         </w:rPr>
-        <w:t>* — голоса разделились 2:2 (разброс 0.49): словарные модели и бустинг смотрят на разные признаки; итог — спам.</w:t>
+        <w:t xml:space="preserve"> — голоса разделились 2:2 (разброс 0.49): словарные модели и бустинг смотрят на разные признаки; итог — спам.</w:t>
       </w:r>
     </w:p>
     <w:p>
+      <w:pPr>
+        <w:spacing w:after="100" w:line="259" w:lineRule="auto"/>
+      </w:pPr>
       <w:r>
         <w:rPr>
           <w:b w:val="0"/>
@@ -3262,10 +4039,13 @@
           <w:b w:val="0"/>
           <w:i w:val="0"/>
         </w:rPr>
-        <w:t>* — голоса разделились 2:2 (разброс 0.38): словарные модели и бустинг смотрят на разные признаки; итог — спам.</w:t>
+        <w:t xml:space="preserve"> — голоса разделились 2:2 (разброс 0.38): словарные модели и бустинг смотрят на разные признаки; итог — спам.</w:t>
       </w:r>
     </w:p>
     <w:p>
+      <w:pPr>
+        <w:spacing w:after="100" w:line="259" w:lineRule="auto"/>
+      </w:pPr>
       <w:r>
         <w:rPr>
           <w:b w:val="0"/>
@@ -3285,10 +4065,13 @@
           <w:b w:val="0"/>
           <w:i w:val="0"/>
         </w:rPr>
-        <w:t>* — все четыре модели за спам, но мета-модель опустила итог до 0.699 (порог 0.71); итог — норма.</w:t>
+        <w:t xml:space="preserve"> — все четыре модели за спам, но мета-модель опустила итог до 0.699 (порог 0.71); итог — норма.</w:t>
       </w:r>
     </w:p>
     <w:p>
+      <w:pPr>
+        <w:spacing w:after="100" w:line="259" w:lineRule="auto"/>
+      </w:pPr>
       <w:r>
         <w:rPr>
           <w:b w:val="0"/>
@@ -3308,12 +4091,13 @@
           <w:b w:val="0"/>
           <w:i w:val="0"/>
         </w:rPr>
-        <w:t>* — за спам только GB (разброс 0.79), остальные против; итог — норма.</w:t>
+        <w:t xml:space="preserve"> — за спам только GB (разброс 0.79), остальные против; итог — норма.</w:t>
       </w:r>
     </w:p>
     <w:p>
       <w:pPr>
         <w:pStyle w:val="Heading2"/>
+        <w:spacing w:after="100" w:line="259" w:lineRule="auto"/>
       </w:pPr>
       <w:r>
         <w:rPr>
@@ -3326,6 +4110,7 @@
     <w:p>
       <w:pPr>
         <w:pStyle w:val="Heading3"/>
+        <w:spacing w:after="100" w:line="259" w:lineRule="auto"/>
       </w:pPr>
       <w:r>
         <w:rPr>
@@ -3336,6 +4121,9 @@
       </w:r>
     </w:p>
     <w:p>
+      <w:pPr>
+        <w:spacing w:after="100" w:line="259" w:lineRule="auto"/>
+      </w:pPr>
       <w:r>
         <w:rPr>
           <w:b w:val="0"/>
@@ -3355,10 +4143,13 @@
           <w:b w:val="0"/>
           <w:i w:val="0"/>
         </w:rPr>
-        <w:t>* Google AdSense: Ваш аккаунт закрыт</w:t>
+        <w:t xml:space="preserve"> Google AdSense: Ваш аккаунт закрыт</w:t>
       </w:r>
     </w:p>
     <w:p>
+      <w:pPr>
+        <w:spacing w:after="100" w:line="259" w:lineRule="auto"/>
+      </w:pPr>
       <w:r>
         <w:rPr>
           <w:b w:val="0"/>
@@ -3378,10 +4169,13 @@
           <w:b w:val="0"/>
           <w:i w:val="0"/>
         </w:rPr>
-        <w:t>* Google AdSense: Ваш аккаунт закрыт Ваш аккаунт закрыт Ваш аккаунт Google AdSense закрыт, как Вы и просили. Если на Вашем балансе осталось больше 10,00 $, мы перешлем Вам эти средства в следующем платежном цикле. Если же сумма будет меньше 10,00 $, она останется в аккаунте. Справочный центр Связаться с нами Идентификатор клиента в сервисе …</w:t>
+        <w:t xml:space="preserve"> Google AdSense: Ваш аккаунт закрыт Ваш аккаунт закрыт Ваш аккаунт Google AdSense закрыт, как Вы и просили. Если на Вашем балансе осталось больше 10,00 $, мы перешлем Вам эти средства в следующем платежном цикле. Если же сумма будет меньше 10,00 $, она останется в аккаунте. Справочный центр Связаться с нами Идентификатор клиента в сервисе …</w:t>
       </w:r>
     </w:p>
     <w:p>
+      <w:pPr>
+        <w:spacing w:after="100" w:line="259" w:lineRule="auto"/>
+      </w:pPr>
       <w:r>
         <w:rPr>
           <w:b w:val="0"/>
@@ -3401,10 +4195,13 @@
           <w:b w:val="0"/>
           <w:i w:val="0"/>
         </w:rPr>
-        <w:t>* LR 0.10 · SVM 0.01 · NB 0.06 · GB 0.90</w:t>
+        <w:t xml:space="preserve"> LR 0.10 · SVM 0.01 · NB 0.06 · GB 0.90</w:t>
       </w:r>
     </w:p>
     <w:p>
+      <w:pPr>
+        <w:spacing w:after="100" w:line="259" w:lineRule="auto"/>
+      </w:pPr>
       <w:r>
         <w:rPr>
           <w:b w:val="0"/>
@@ -3424,12 +4221,13 @@
           <w:b w:val="0"/>
           <w:i w:val="0"/>
         </w:rPr>
-        <w:t>* за спам только GB (разброс 0.89), остальные против; итог — спам.</w:t>
+        <w:t xml:space="preserve"> за спам только GB (разброс 0.89), остальные против; итог — спам.</w:t>
       </w:r>
     </w:p>
     <w:p>
       <w:pPr>
         <w:pStyle w:val="Heading3"/>
+        <w:spacing w:after="100" w:line="259" w:lineRule="auto"/>
       </w:pPr>
       <w:r>
         <w:rPr>
@@ -3440,6 +4238,9 @@
       </w:r>
     </w:p>
     <w:p>
+      <w:pPr>
+        <w:spacing w:after="100" w:line="259" w:lineRule="auto"/>
+      </w:pPr>
       <w:r>
         <w:rPr>
           <w:b w:val="0"/>
@@ -3459,10 +4260,13 @@
           <w:b w:val="0"/>
           <w:i w:val="0"/>
         </w:rPr>
-        <w:t>* PythonAnywhere: confirm your email address</w:t>
+        <w:t xml:space="preserve"> PythonAnywhere: confirm your email address</w:t>
       </w:r>
     </w:p>
     <w:p>
+      <w:pPr>
+        <w:spacing w:after="100" w:line="259" w:lineRule="auto"/>
+      </w:pPr>
       <w:r>
         <w:rPr>
           <w:b w:val="0"/>
@@ -3482,10 +4286,13 @@
           <w:b w:val="0"/>
           <w:i w:val="0"/>
         </w:rPr>
-        <w:t>* PythonAnywhere: confirm your email address Hi man, Thanks for signing up for PythonAnywhere! Please click on the following link to confirm your email address: &lt;ссылка&gt; This means you will be able to reset your password if you forget it later, which is especially important if you have a paid account! If you can't click the link from your e…</w:t>
+        <w:t xml:space="preserve"> PythonAnywhere: confirm your email address Hi man, Thanks for signing up for PythonAnywhere! Please click on the following link to confirm your email address: &lt;ссылка&gt; This means you will be able to reset your password if you forget it later, which is especially important if you have a paid account! If you can't click the link from your e…</w:t>
       </w:r>
     </w:p>
     <w:p>
+      <w:pPr>
+        <w:spacing w:after="100" w:line="259" w:lineRule="auto"/>
+      </w:pPr>
       <w:r>
         <w:rPr>
           <w:b w:val="0"/>
@@ -3505,10 +4312,13 @@
           <w:b w:val="0"/>
           <w:i w:val="0"/>
         </w:rPr>
-        <w:t>* LR 0.63 · SVM 0.60 · NB 0.94 · GB 0.98</w:t>
+        <w:t xml:space="preserve"> LR 0.63 · SVM 0.60 · NB 0.94 · GB 0.98</w:t>
       </w:r>
     </w:p>
     <w:p>
+      <w:pPr>
+        <w:spacing w:after="100" w:line="259" w:lineRule="auto"/>
+      </w:pPr>
       <w:r>
         <w:rPr>
           <w:b w:val="0"/>
@@ -3528,12 +4338,13 @@
           <w:b w:val="0"/>
           <w:i w:val="0"/>
         </w:rPr>
-        <w:t>* голоса разделились 2:2 (разброс 0.39): словарные модели и бустинг смотрят на разные признаки; итог — спам.</w:t>
+        <w:t xml:space="preserve"> голоса разделились 2:2 (разброс 0.39): словарные модели и бустинг смотрят на разные признаки; итог — спам.</w:t>
       </w:r>
     </w:p>
     <w:p>
       <w:pPr>
         <w:pStyle w:val="Heading3"/>
+        <w:spacing w:after="100" w:line="259" w:lineRule="auto"/>
       </w:pPr>
       <w:r>
         <w:rPr>
@@ -3544,6 +4355,9 @@
       </w:r>
     </w:p>
     <w:p>
+      <w:pPr>
+        <w:spacing w:after="100" w:line="259" w:lineRule="auto"/>
+      </w:pPr>
       <w:r>
         <w:rPr>
           <w:b w:val="0"/>
@@ -3563,10 +4377,13 @@
           <w:b w:val="0"/>
           <w:i w:val="0"/>
         </w:rPr>
-        <w:t>* Your account access has been limited</w:t>
+        <w:t xml:space="preserve"> Your account access has been limited</w:t>
       </w:r>
     </w:p>
     <w:p>
+      <w:pPr>
+        <w:spacing w:after="100" w:line="259" w:lineRule="auto"/>
+      </w:pPr>
       <w:r>
         <w:rPr>
           <w:b w:val="0"/>
@@ -3586,10 +4403,13 @@
           <w:b w:val="0"/>
           <w:i w:val="0"/>
         </w:rPr>
-        <w:t>* Your account access has been limited Notification of Limited Account Access As part of our security measures, we regularly screen activity in the PayPal system. We recently noticed the following issue on your account: Unusual account activity has made it necessary to limit account access until additional verification information can be co…</w:t>
+        <w:t xml:space="preserve"> Your account access has been limited Notification of Limited Account Access As part of our security measures, we regularly screen activity in the PayPal system. We recently noticed the following issue on your account: Unusual account activity has made it necessary to limit account access until additional verification information can be co…</w:t>
       </w:r>
     </w:p>
     <w:p>
+      <w:pPr>
+        <w:spacing w:after="100" w:line="259" w:lineRule="auto"/>
+      </w:pPr>
       <w:r>
         <w:rPr>
           <w:b w:val="0"/>
@@ -3609,10 +4429,13 @@
           <w:b w:val="0"/>
           <w:i w:val="0"/>
         </w:rPr>
-        <w:t>* LR 0.78 · SVM 0.85 · NB 0.89 · GB 0.77</w:t>
+        <w:t xml:space="preserve"> LR 0.78 · SVM 0.85 · NB 0.89 · GB 0.77</w:t>
       </w:r>
     </w:p>
     <w:p>
+      <w:pPr>
+        <w:spacing w:after="100" w:line="259" w:lineRule="auto"/>
+      </w:pPr>
       <w:r>
         <w:rPr>
           <w:b w:val="0"/>
@@ -3632,12 +4455,13 @@
           <w:b w:val="0"/>
           <w:i w:val="0"/>
         </w:rPr>
-        <w:t>* все четыре модели за спам, но мета-модель опустила итог до 0.704 (порог 0.71); итог — норма.</w:t>
+        <w:t xml:space="preserve"> все четыре модели за спам, но мета-модель опустила итог до 0.704 (порог 0.71); итог — норма.</w:t>
       </w:r>
     </w:p>
     <w:p>
       <w:pPr>
         <w:pStyle w:val="Heading3"/>
+        <w:spacing w:after="100" w:line="259" w:lineRule="auto"/>
       </w:pPr>
       <w:r>
         <w:rPr>
@@ -3648,6 +4472,9 @@
       </w:r>
     </w:p>
     <w:p>
+      <w:pPr>
+        <w:spacing w:after="100" w:line="259" w:lineRule="auto"/>
+      </w:pPr>
       <w:r>
         <w:rPr>
           <w:b w:val="0"/>
@@ -3667,10 +4494,13 @@
           <w:b w:val="0"/>
           <w:i w:val="0"/>
         </w:rPr>
-        <w:t>* Question for item #250026510836 - Respond Now</w:t>
+        <w:t xml:space="preserve"> Question for item #250026510836 - Respond Now</w:t>
       </w:r>
     </w:p>
     <w:p>
+      <w:pPr>
+        <w:spacing w:after="100" w:line="259" w:lineRule="auto"/>
+      </w:pPr>
       <w:r>
         <w:rPr>
           <w:b w:val="0"/>
@@ -3690,10 +4520,13 @@
           <w:b w:val="0"/>
           <w:i w:val="0"/>
         </w:rPr>
-        <w:t>* Question for item #250026510836 - Respond Now Re: Question for item #8812386909 - DELL PRECISION M20 LAPTOP BRAND NEW BOXED!!! NO RESERVE Learn more . Response to Question about Item -- Respond Now eBay sent this message on behalf of an eBay member via My Messages. Responses sent using email will go to the eBay member directly and will in…</w:t>
+        <w:t xml:space="preserve"> Question for item #250026510836 - Respond Now Re: Question for item #8812386909 - DELL PRECISION M20 LAPTOP BRAND NEW BOXED!!! NO RESERVE Learn more . Response to Question about Item -- Respond Now eBay sent this message on behalf of an eBay member via My Messages. Responses sent using email will go to the eBay member directly and will in…</w:t>
       </w:r>
     </w:p>
     <w:p>
+      <w:pPr>
+        <w:spacing w:after="100" w:line="259" w:lineRule="auto"/>
+      </w:pPr>
       <w:r>
         <w:rPr>
           <w:b w:val="0"/>
@@ -3713,10 +4546,13 @@
           <w:b w:val="0"/>
           <w:i w:val="0"/>
         </w:rPr>
-        <w:t>* LR 0.48 · SVM 0.42 · NB 0.81 · GB 0.07</w:t>
+        <w:t xml:space="preserve"> LR 0.48 · SVM 0.42 · NB 0.81 · GB 0.07</w:t>
       </w:r>
     </w:p>
     <w:p>
+      <w:pPr>
+        <w:spacing w:after="100" w:line="259" w:lineRule="auto"/>
+      </w:pPr>
       <w:r>
         <w:rPr>
           <w:b w:val="0"/>
@@ -3736,12 +4572,13 @@
           <w:b w:val="0"/>
           <w:i w:val="0"/>
         </w:rPr>
-        <w:t>* за спам только NB (разброс 0.74), остальные против; итог — норма.</w:t>
+        <w:t xml:space="preserve"> за спам только NB (разброс 0.74), остальные против; итог — норма.</w:t>
       </w:r>
     </w:p>
     <w:p>
       <w:pPr>
         <w:pStyle w:val="Heading2"/>
+        <w:spacing w:after="100" w:line="259" w:lineRule="auto"/>
       </w:pPr>
       <w:r>
         <w:rPr>
@@ -3752,6 +4589,9 @@
       </w:r>
     </w:p>
     <w:p>
+      <w:pPr>
+        <w:spacing w:after="100" w:line="259" w:lineRule="auto"/>
+      </w:pPr>
       <w:r>
         <w:rPr>
           <w:b w:val="0"/>
@@ -3775,6 +4615,9 @@
       </w:r>
     </w:p>
     <w:p>
+      <w:pPr>
+        <w:spacing w:after="100" w:line="259" w:lineRule="auto"/>
+      </w:pPr>
       <w:r>
         <w:rPr>
           <w:b w:val="0"/>
@@ -3784,6 +4627,9 @@
       </w:r>
     </w:p>
     <w:p>
+      <w:pPr>
+        <w:spacing w:after="100" w:line="259" w:lineRule="auto"/>
+      </w:pPr>
       <w:r>
         <w:rPr>
           <w:b w:val="0"/>
@@ -3793,6 +4639,9 @@
       </w:r>
     </w:p>
     <w:p>
+      <w:pPr>
+        <w:spacing w:after="100" w:line="259" w:lineRule="auto"/>
+      </w:pPr>
       <w:r>
         <w:rPr>
           <w:b w:val="0"/>
@@ -3816,6 +4665,9 @@
       </w:r>
     </w:p>
     <w:p>
+      <w:pPr>
+        <w:spacing w:after="100" w:line="259" w:lineRule="auto"/>
+      </w:pPr>
       <w:r>
         <w:rPr>
           <w:b w:val="0"/>
@@ -3825,6 +4677,9 @@
       </w:r>
     </w:p>
     <w:p>
+      <w:pPr>
+        <w:spacing w:after="100" w:line="259" w:lineRule="auto"/>
+      </w:pPr>
       <w:r>
         <w:rPr>
           <w:b w:val="0"/>
@@ -3834,6 +4689,9 @@
       </w:r>
     </w:p>
     <w:p>
+      <w:pPr>
+        <w:spacing w:after="100" w:line="259" w:lineRule="auto"/>
+      </w:pPr>
       <w:r>
         <w:rPr>
           <w:b w:val="0"/>
@@ -3857,6 +4715,9 @@
       </w:r>
     </w:p>
     <w:p>
+      <w:pPr>
+        <w:spacing w:after="100" w:line="259" w:lineRule="auto"/>
+      </w:pPr>
       <w:r>
         <w:rPr>
           <w:b w:val="0"/>
@@ -3866,6 +4727,9 @@
       </w:r>
     </w:p>
     <w:p>
+      <w:pPr>
+        <w:spacing w:after="100" w:line="259" w:lineRule="auto"/>
+      </w:pPr>
       <w:r>
         <w:rPr>
           <w:b w:val="0"/>
@@ -3875,6 +4739,9 @@
       </w:r>
     </w:p>
     <w:p>
+      <w:pPr>
+        <w:spacing w:after="100" w:line="259" w:lineRule="auto"/>
+      </w:pPr>
       <w:r>
         <w:rPr>
           <w:b w:val="0"/>
@@ -3898,6 +4765,9 @@
       </w:r>
     </w:p>
     <w:p>
+      <w:pPr>
+        <w:spacing w:after="100" w:line="259" w:lineRule="auto"/>
+      </w:pPr>
       <w:r>
         <w:rPr>
           <w:b w:val="0"/>
@@ -3907,6 +4777,9 @@
       </w:r>
     </w:p>
     <w:p>
+      <w:pPr>
+        <w:spacing w:after="100" w:line="259" w:lineRule="auto"/>
+      </w:pPr>
       <w:r>
         <w:rPr>
           <w:b w:val="0"/>
@@ -3918,6 +4791,7 @@
     <w:p>
       <w:pPr>
         <w:pStyle w:val="Heading2"/>
+        <w:spacing w:after="100" w:line="259" w:lineRule="auto"/>
       </w:pPr>
       <w:r>
         <w:rPr>
@@ -3928,33 +4802,23 @@
       </w:r>
     </w:p>
     <w:p>
+      <w:pPr>
+        <w:spacing w:after="100" w:line="259" w:lineRule="auto"/>
+      </w:pPr>
       <w:r>
         <w:rPr>
+          <w:rFonts w:ascii="Courier New" w:hAnsi="Courier New"/>
           <w:b w:val="0"/>
           <w:i w:val="0"/>
-        </w:rPr>
-        <w:t>```bash</w:t>
-      </w:r>
-    </w:p>
-    <w:p>
-      <w:r>
-        <w:rPr>
-          <w:b w:val="0"/>
-          <w:i w:val="0"/>
+          <w:sz w:val="20"/>
         </w:rPr>
         <w:t>python tools/make_borderline_report.py</w:t>
       </w:r>
     </w:p>
     <w:p>
-      <w:r>
-        <w:rPr>
-          <w:b w:val="0"/>
-          <w:i w:val="0"/>
-        </w:rPr>
-        <w:t>```</w:t>
-      </w:r>
-    </w:p>
-    <w:p>
+      <w:pPr>
+        <w:spacing w:after="100" w:line="259" w:lineRule="auto"/>
+      </w:pPr>
       <w:r>
         <w:rPr>
           <w:b w:val="0"/>
@@ -3964,6 +4828,9 @@
       </w:r>
     </w:p>
     <w:p>
+      <w:pPr>
+        <w:spacing w:after="100" w:line="259" w:lineRule="auto"/>
+      </w:pPr>
       <w:r>
         <w:rPr>
           <w:b w:val="0"/>
@@ -3973,6 +4840,10 @@
       </w:r>
     </w:p>
     <w:p>
+      <w:pPr>
+        <w:keepLines/>
+        <w:spacing w:after="100" w:line="259" w:lineRule="auto"/>
+      </w:pPr>
       <w:r>
         <w:rPr>
           <w:b w:val="0"/>
@@ -4751,9 +5622,6 @@
     <w:qFormat/>
     <w:rsid w:val="00FC693F"/>
     <w:pPr>
-      <w:pBdr>
-        <w:bottom w:val="single" w:sz="8" w:space="4" w:color="4F81BD" w:themeColor="accent1"/>
-      </w:pBdr>
       <w:spacing w:after="300" w:line="240" w:lineRule="auto"/>
       <w:contextualSpacing/>
     </w:pPr>

</xml_diff>